<commit_message>
Refine AstraZeneca typography, citation emphasis and header alignment
</commit_message>
<xml_diff>
--- a/resumes/Samya_Samanta_AstraZeneca_Adaptive_Chemistry.docx
+++ b/resumes/Samya_Samanta_AstraZeneca_Adaptive_Chemistry.docx
@@ -39,7 +39,7 @@
         <w:r>
           <w:rPr>
             <w:rStyle w:val="Hyperlink"/>
-            <w:rFonts w:eastAsia="Arial" w:cs="Arial"/>
+            <w:rFonts w:eastAsia="Arial" w:cs="Arial" w:ascii="Arial" w:hAnsi="Arial"/>
             <w:bCs/>
             <w:i/>
             <w:iCs/>
@@ -52,7 +52,7 @@
       </w:hyperlink>
       <w:r>
         <w:rPr>
-          <w:rFonts w:eastAsia="Arial" w:cs="Arial"/>
+          <w:rFonts w:eastAsia="Arial" w:cs="Arial" w:ascii="Arial" w:hAnsi="Arial"/>
           <w:bCs/>
           <w:sz w:val="18"/>
           <w:szCs w:val="16"/>
@@ -62,7 +62,7 @@
       </w:r>
       <w:r>
         <w:rPr>
-          <w:rFonts w:eastAsia="Arial" w:cs="Arial"/>
+          <w:rFonts w:eastAsia="Arial" w:cs="Arial" w:ascii="Arial" w:hAnsi="Arial"/>
           <w:bCs/>
           <w:sz w:val="18"/>
           <w:szCs w:val="16"/>
@@ -88,7 +88,7 @@
       </w:pPr>
       <w:r>
         <w:rPr>
-          <w:rFonts w:eastAsia="Arial" w:cs="Arial"/>
+          <w:rFonts w:eastAsia="Arial" w:cs="Arial" w:ascii="Arial" w:hAnsi="Arial"/>
           <w:color w:val="253D50"/>
           <w:sz w:val="21"/>
           <w:b/>
@@ -98,7 +98,7 @@
       </w:r>
       <w:r>
         <w:rPr>
-          <w:rFonts w:eastAsia="Arial" w:cs="Arial"/>
+          <w:rFonts w:eastAsia="Arial" w:cs="Arial" w:ascii="Arial" w:hAnsi="Arial"/>
           <w:color w:val="253D50"/>
           <w:sz w:val="21"/>
           <w:b/>
@@ -108,7 +108,7 @@
       </w:r>
       <w:r>
         <w:rPr>
-          <w:rFonts w:eastAsia="Arial" w:cs="Arial"/>
+          <w:rFonts w:eastAsia="Arial" w:cs="Arial" w:ascii="Arial" w:hAnsi="Arial"/>
           <w:color w:val="253D50"/>
           <w:sz w:val="21"/>
           <w:b/>
@@ -131,7 +131,7 @@
       </w:pPr>
       <w:r>
         <w:rPr>
-          <w:rFonts w:eastAsia="Arial" w:cs="Arial"/>
+          <w:rFonts w:eastAsia="Palatino" w:cs="Palatino" w:ascii="Palatino" w:hAnsi="Palatino"/>
           <w:b/>
           <w:bCs/>
           <w:sz w:val="20"/>
@@ -142,7 +142,7 @@
       </w:r>
       <w:r>
         <w:rPr>
-          <w:rFonts w:eastAsia="Arial" w:cs="Arial"/>
+          <w:rFonts w:eastAsia="Palatino" w:cs="Palatino" w:ascii="Palatino" w:hAnsi="Palatino"/>
           <w:color w:val="606A74"/>
           <w:sz w:val="20"/>
           <w:szCs w:val="20"/>
@@ -153,7 +153,7 @@
       </w:r>
       <w:r>
         <w:rPr>
-          <w:rFonts w:eastAsia="Arial" w:cs="Arial"/>
+          <w:rFonts w:eastAsia="Palatino" w:cs="Palatino" w:ascii="Palatino" w:hAnsi="Palatino"/>
           <w:b w:val="0"/>
           <w:bCs/>
           <w:i w:val="0"/>
@@ -166,7 +166,7 @@
       </w:r>
       <w:r>
         <w:rPr>
-          <w:rFonts w:eastAsia="Arial" w:cs="Arial"/>
+          <w:rFonts w:eastAsia="Palatino" w:cs="Palatino" w:ascii="Palatino" w:hAnsi="Palatino"/>
           <w:b w:val="0"/>
           <w:bCs/>
           <w:i w:val="0"/>
@@ -179,7 +179,7 @@
       </w:r>
       <w:r>
         <w:rPr>
-          <w:rFonts w:eastAsia="Arial" w:cs="Arial"/>
+          <w:rFonts w:eastAsia="Palatino" w:cs="Palatino" w:ascii="Palatino" w:hAnsi="Palatino"/>
           <w:b w:val="0"/>
           <w:bCs/>
           <w:i w:val="0"/>
@@ -204,7 +204,7 @@
       </w:pPr>
       <w:r>
         <w:rPr>
-          <w:rFonts w:ascii="Arial" w:hAnsi="Arial"/>
+          <w:rFonts w:ascii="Palatino" w:hAnsi="Palatino" w:eastAsia="Palatino" w:cs="Palatino"/>
           <w:b w:val="0"/>
           <w:sz w:val="20"/>
         </w:rPr>
@@ -224,7 +224,7 @@
       </w:pPr>
       <w:r>
         <w:rPr>
-          <w:rFonts w:eastAsia="Arial" w:cs="Arial"/>
+          <w:rFonts w:eastAsia="Palatino" w:cs="Palatino" w:ascii="Palatino" w:hAnsi="Palatino"/>
           <w:i/>
           <w:iCs/>
           <w:sz w:val="20"/>
@@ -235,7 +235,7 @@
       </w:r>
       <w:r>
         <w:rPr>
-          <w:rFonts w:eastAsia="Arial" w:cs="Arial"/>
+          <w:rFonts w:eastAsia="Palatino" w:cs="Palatino" w:ascii="Palatino" w:hAnsi="Palatino"/>
           <w:sz w:val="20"/>
           <w:szCs w:val="20"/>
           <w:color w:val="292D32"/>
@@ -244,7 +244,7 @@
       </w:r>
       <w:r>
         <w:rPr>
-          <w:rFonts w:eastAsia="Arial" w:cs="Arial"/>
+          <w:rFonts w:eastAsia="Palatino" w:cs="Palatino" w:ascii="Palatino" w:hAnsi="Palatino"/>
           <w:bCs/>
           <w:sz w:val="20"/>
           <w:szCs w:val="20"/>
@@ -254,7 +254,7 @@
       </w:r>
       <w:r>
         <w:rPr>
-          <w:rFonts w:eastAsia="Arial" w:cs="Arial"/>
+          <w:rFonts w:eastAsia="Palatino" w:cs="Palatino" w:ascii="Palatino" w:hAnsi="Palatino"/>
           <w:sz w:val="20"/>
           <w:szCs w:val="20"/>
           <w:color w:val="292D32"/>
@@ -263,7 +263,7 @@
       </w:r>
       <w:r>
         <w:rPr>
-          <w:rFonts w:eastAsia="Arial" w:cs="Arial"/>
+          <w:rFonts w:eastAsia="Palatino" w:cs="Palatino" w:ascii="Palatino" w:hAnsi="Palatino"/>
           <w:sz w:val="20"/>
           <w:szCs w:val="20"/>
           <w:color w:val="292D32"/>
@@ -272,7 +272,7 @@
       </w:r>
       <w:r>
         <w:rPr>
-          <w:rFonts w:eastAsia="Arial" w:cs="Arial"/>
+          <w:rFonts w:eastAsia="Palatino" w:cs="Palatino" w:ascii="Palatino" w:hAnsi="Palatino"/>
           <w:sz w:val="20"/>
           <w:szCs w:val="20"/>
           <w:color w:val="292D32"/>
@@ -281,7 +281,7 @@
       </w:r>
       <w:r>
         <w:rPr>
-          <w:rFonts w:eastAsia="Arial" w:cs="Arial"/>
+          <w:rFonts w:eastAsia="Palatino" w:cs="Palatino" w:ascii="Palatino" w:hAnsi="Palatino"/>
           <w:bCs/>
           <w:sz w:val="20"/>
           <w:szCs w:val="20"/>
@@ -291,7 +291,7 @@
       </w:r>
       <w:r>
         <w:rPr>
-          <w:rFonts w:eastAsia="Arial" w:cs="Arial"/>
+          <w:rFonts w:eastAsia="Palatino" w:cs="Palatino" w:ascii="Palatino" w:hAnsi="Palatino"/>
           <w:sz w:val="20"/>
           <w:szCs w:val="20"/>
           <w:color w:val="292D32"/>
@@ -313,7 +313,7 @@
       </w:pPr>
       <w:r>
         <w:rPr>
-          <w:rFonts w:eastAsia="Arial" w:cs="Arial"/>
+          <w:rFonts w:eastAsia="Palatino" w:cs="Palatino" w:ascii="Palatino" w:hAnsi="Palatino"/>
           <w:b/>
           <w:bCs/>
           <w:sz w:val="20"/>
@@ -324,7 +324,7 @@
       </w:r>
       <w:r>
         <w:rPr>
-          <w:rFonts w:eastAsia="Arial" w:cs="Arial"/>
+          <w:rFonts w:eastAsia="Palatino" w:cs="Palatino" w:ascii="Palatino" w:hAnsi="Palatino"/>
           <w:b w:val="0"/>
           <w:bCs/>
           <w:color w:val="606A74"/>
@@ -336,7 +336,7 @@
       </w:r>
       <w:r>
         <w:rPr>
-          <w:rFonts w:eastAsia="Arial" w:cs="Arial"/>
+          <w:rFonts w:eastAsia="Palatino" w:cs="Palatino" w:ascii="Palatino" w:hAnsi="Palatino"/>
           <w:b w:val="0"/>
           <w:bCs/>
           <w:i w:val="0"/>
@@ -349,7 +349,7 @@
       </w:r>
       <w:r>
         <w:rPr>
-          <w:rFonts w:eastAsia="Arial" w:cs="Arial"/>
+          <w:rFonts w:eastAsia="Palatino" w:cs="Palatino" w:ascii="Palatino" w:hAnsi="Palatino"/>
           <w:b w:val="0"/>
           <w:bCs/>
           <w:i w:val="0"/>
@@ -362,7 +362,7 @@
       </w:r>
       <w:r>
         <w:rPr>
-          <w:rFonts w:eastAsia="Arial" w:cs="Arial"/>
+          <w:rFonts w:eastAsia="Palatino" w:cs="Palatino" w:ascii="Palatino" w:hAnsi="Palatino"/>
           <w:b w:val="0"/>
           <w:bCs/>
           <w:i w:val="0"/>
@@ -375,7 +375,7 @@
       </w:r>
       <w:r>
         <w:rPr>
-          <w:rFonts w:eastAsia="Arial" w:cs="Arial"/>
+          <w:rFonts w:eastAsia="Palatino" w:cs="Palatino" w:ascii="Palatino" w:hAnsi="Palatino"/>
           <w:b w:val="0"/>
           <w:bCs/>
           <w:i w:val="0"/>
@@ -388,7 +388,7 @@
       </w:r>
       <w:r>
         <w:rPr>
-          <w:rFonts w:eastAsia="Arial" w:cs="Arial"/>
+          <w:rFonts w:eastAsia="Palatino" w:cs="Palatino" w:ascii="Palatino" w:hAnsi="Palatino"/>
           <w:b w:val="0"/>
           <w:bCs/>
           <w:i w:val="0"/>
@@ -413,7 +413,7 @@
       </w:pPr>
       <w:r>
         <w:rPr>
-          <w:rFonts w:eastAsia="Arial" w:cs="Arial"/>
+          <w:rFonts w:eastAsia="Arial" w:cs="Arial" w:ascii="Arial" w:hAnsi="Arial"/>
           <w:sz w:val="20"/>
           <w:szCs w:val="20"/>
           <w:color w:val="292D32"/>
@@ -438,7 +438,7 @@
       </w:pPr>
       <w:r>
         <w:rPr>
-          <w:rFonts w:eastAsia="Arial" w:cs="Arial"/>
+          <w:rFonts w:eastAsia="Arial" w:cs="Arial" w:ascii="Arial" w:hAnsi="Arial"/>
           <w:color w:val="253D50"/>
           <w:sz w:val="21"/>
           <w:b/>
@@ -460,7 +460,7 @@
       </w:pPr>
       <w:r>
         <w:rPr>
-          <w:rFonts w:ascii="Arial" w:hAnsi="Arial"/>
+          <w:rFonts w:ascii="Palatino" w:hAnsi="Palatino" w:eastAsia="Palatino" w:cs="Palatino"/>
           <w:b w:val="0"/>
           <w:sz w:val="20"/>
         </w:rPr>
@@ -484,7 +484,7 @@
       </w:pPr>
       <w:r>
         <w:rPr>
-          <w:rFonts w:eastAsia="Arial" w:cs="Arial"/>
+          <w:rFonts w:eastAsia="Arial" w:cs="Arial" w:ascii="Arial" w:hAnsi="Arial"/>
           <w:color w:val="253D50"/>
           <w:sz w:val="21"/>
           <w:b/>
@@ -494,7 +494,7 @@
       </w:r>
       <w:r>
         <w:rPr>
-          <w:rFonts w:eastAsia="Arial" w:cs="Arial"/>
+          <w:rFonts w:eastAsia="Arial" w:cs="Arial" w:ascii="Arial" w:hAnsi="Arial"/>
           <w:color w:val="253D50"/>
           <w:sz w:val="21"/>
           <w:b/>
@@ -517,7 +517,7 @@
       </w:pPr>
       <w:r>
         <w:rPr>
-          <w:rFonts w:ascii="Arial" w:hAnsi="Arial"/>
+          <w:rFonts w:ascii="Palatino" w:hAnsi="Palatino" w:eastAsia="Palatino" w:cs="Palatino"/>
           <w:b/>
           <w:sz w:val="20"/>
         </w:rPr>
@@ -525,7 +525,7 @@
       </w:r>
       <w:r>
         <w:rPr>
-          <w:rFonts w:ascii="Arial" w:hAnsi="Arial"/>
+          <w:rFonts w:ascii="Palatino" w:hAnsi="Palatino" w:eastAsia="Palatino" w:cs="Palatino"/>
           <w:b w:val="0"/>
           <w:sz w:val="20"/>
         </w:rPr>
@@ -546,7 +546,7 @@
       </w:pPr>
       <w:r>
         <w:rPr>
-          <w:rFonts w:ascii="Arial" w:hAnsi="Arial"/>
+          <w:rFonts w:ascii="Palatino" w:hAnsi="Palatino" w:eastAsia="Palatino" w:cs="Palatino"/>
           <w:b/>
           <w:sz w:val="20"/>
         </w:rPr>
@@ -554,7 +554,7 @@
       </w:r>
       <w:r>
         <w:rPr>
-          <w:rFonts w:ascii="Arial" w:hAnsi="Arial"/>
+          <w:rFonts w:ascii="Palatino" w:hAnsi="Palatino" w:eastAsia="Palatino" w:cs="Palatino"/>
           <w:b w:val="0"/>
           <w:sz w:val="20"/>
         </w:rPr>
@@ -575,7 +575,7 @@
       </w:pPr>
       <w:r>
         <w:rPr>
-          <w:rFonts w:ascii="Arial" w:hAnsi="Arial"/>
+          <w:rFonts w:ascii="Palatino" w:hAnsi="Palatino" w:eastAsia="Palatino" w:cs="Palatino"/>
           <w:b/>
           <w:sz w:val="20"/>
         </w:rPr>
@@ -583,7 +583,7 @@
       </w:r>
       <w:r>
         <w:rPr>
-          <w:rFonts w:ascii="Arial" w:hAnsi="Arial"/>
+          <w:rFonts w:ascii="Palatino" w:hAnsi="Palatino" w:eastAsia="Palatino" w:cs="Palatino"/>
           <w:b w:val="0"/>
           <w:sz w:val="20"/>
         </w:rPr>
@@ -607,7 +607,7 @@
       </w:pPr>
       <w:r>
         <w:rPr>
-          <w:rFonts w:eastAsia="Arial" w:cs="Arial"/>
+          <w:rFonts w:eastAsia="Arial" w:cs="Arial" w:ascii="Arial" w:hAnsi="Arial"/>
           <w:color w:val="253D50"/>
           <w:sz w:val="21"/>
           <w:b/>
@@ -630,7 +630,7 @@
       </w:pPr>
       <w:r>
         <w:rPr>
-          <w:rFonts w:eastAsia="Arial" w:cs="Arial"/>
+          <w:rFonts w:eastAsia="Palatino" w:cs="Palatino" w:ascii="Palatino" w:hAnsi="Palatino"/>
           <w:b/>
           <w:bCs/>
           <w:sz w:val="20"/>
@@ -641,7 +641,7 @@
       </w:r>
       <w:r>
         <w:rPr>
-          <w:rFonts w:eastAsia="Arial" w:cs="Arial"/>
+          <w:rFonts w:eastAsia="Palatino" w:cs="Palatino" w:ascii="Palatino" w:hAnsi="Palatino"/>
           <w:sz w:val="20"/>
           <w:szCs w:val="20"/>
           <w:b/>
@@ -651,7 +651,7 @@
       </w:r>
       <w:r>
         <w:rPr>
-          <w:rFonts w:eastAsia="Arial" w:cs="Arial"/>
+          <w:rFonts w:eastAsia="Palatino" w:cs="Palatino" w:ascii="Palatino" w:hAnsi="Palatino"/>
           <w:b w:val="0"/>
           <w:bCs/>
           <w:i/>
@@ -664,7 +664,7 @@
       </w:r>
       <w:r>
         <w:rPr>
-          <w:rFonts w:eastAsia="Arial" w:cs="Arial"/>
+          <w:rFonts w:eastAsia="Palatino" w:cs="Palatino" w:ascii="Palatino" w:hAnsi="Palatino"/>
           <w:b w:val="0"/>
           <w:bCs/>
           <w:i w:val="0"/>
@@ -677,8 +677,8 @@
       </w:r>
       <w:r>
         <w:rPr>
-          <w:rFonts w:eastAsia="Arial" w:cs="Arial"/>
-          <w:b w:val="0"/>
+          <w:rFonts w:eastAsia="Palatino" w:cs="Palatino" w:ascii="Palatino" w:hAnsi="Palatino"/>
+          <w:b w:val="1"/>
           <w:bCs/>
           <w:i w:val="0"/>
           <w:iCs/>
@@ -686,7 +686,33 @@
           <w:sz w:val="20"/>
           <w:szCs w:val="20"/>
         </w:rPr>
-        <w:t xml:space="preserve">2021 – 2026</w:t>
+        <w:t xml:space="preserve">2021</w:t>
+      </w:r>
+      <w:r>
+        <w:rPr>
+          <w:rFonts w:eastAsia="Palatino" w:cs="Palatino" w:ascii="Palatino" w:hAnsi="Palatino"/>
+          <w:b w:val="0"/>
+          <w:bCs/>
+          <w:i w:val="0"/>
+          <w:iCs/>
+          <w:color w:val="606A74"/>
+          <w:sz w:val="20"/>
+          <w:szCs w:val="20"/>
+        </w:rPr>
+        <w:t xml:space="preserve"> – </w:t>
+      </w:r>
+      <w:r>
+        <w:rPr>
+          <w:rFonts w:eastAsia="Palatino" w:cs="Palatino" w:ascii="Palatino" w:hAnsi="Palatino"/>
+          <w:b w:val="1"/>
+          <w:bCs/>
+          <w:i w:val="0"/>
+          <w:iCs/>
+          <w:color w:val="606A74"/>
+          <w:sz w:val="20"/>
+          <w:szCs w:val="20"/>
+        </w:rPr>
+        <w:t xml:space="preserve">2026</w:t>
       </w:r>
     </w:p>
     <w:p>
@@ -707,7 +733,7 @@
       </w:pPr>
       <w:r>
         <w:rPr>
-          <w:rFonts w:ascii="Arial" w:hAnsi="Arial"/>
+          <w:rFonts w:ascii="Palatino" w:hAnsi="Palatino" w:eastAsia="Palatino" w:cs="Palatino"/>
           <w:b w:val="0"/>
           <w:sz w:val="20"/>
         </w:rPr>
@@ -715,7 +741,7 @@
       </w:r>
       <w:r>
         <w:rPr>
-          <w:rFonts w:ascii="Arial" w:hAnsi="Arial"/>
+          <w:rFonts w:ascii="Palatino" w:hAnsi="Palatino" w:eastAsia="Palatino" w:cs="Palatino"/>
           <w:b w:val="0"/>
           <w:sz w:val="20"/>
           <w:i w:val="1"/>
@@ -724,7 +750,7 @@
       </w:r>
       <w:r>
         <w:rPr>
-          <w:rFonts w:ascii="Arial" w:hAnsi="Arial"/>
+          <w:rFonts w:ascii="Palatino" w:hAnsi="Palatino" w:eastAsia="Palatino" w:cs="Palatino"/>
           <w:b w:val="0"/>
           <w:sz w:val="20"/>
         </w:rPr>
@@ -732,7 +758,7 @@
       </w:r>
       <w:r>
         <w:rPr>
-          <w:rFonts w:ascii="Arial" w:hAnsi="Arial"/>
+          <w:rFonts w:ascii="Palatino" w:hAnsi="Palatino" w:eastAsia="Palatino" w:cs="Palatino"/>
           <w:b w:val="0"/>
           <w:sz w:val="20"/>
           <w:i w:val="1"/>
@@ -742,11 +768,27 @@
       </w:r>
       <w:r>
         <w:rPr>
-          <w:rFonts w:ascii="Arial" w:hAnsi="Arial"/>
+          <w:rFonts w:ascii="Palatino" w:hAnsi="Palatino" w:eastAsia="Palatino" w:cs="Palatino"/>
           <w:b w:val="0"/>
           <w:sz w:val="20"/>
         </w:rPr>
-        <w:t xml:space="preserve"> 2026, 148, 33104–33117).</w:t>
+        <w:t xml:space="preserve"> </w:t>
+      </w:r>
+      <w:r>
+        <w:rPr>
+          <w:rFonts w:ascii="Palatino" w:hAnsi="Palatino" w:eastAsia="Palatino" w:cs="Palatino"/>
+          <w:b w:val="1"/>
+          <w:sz w:val="20"/>
+        </w:rPr>
+        <w:t xml:space="preserve">2026</w:t>
+      </w:r>
+      <w:r>
+        <w:rPr>
+          <w:rFonts w:ascii="Palatino" w:hAnsi="Palatino" w:eastAsia="Palatino" w:cs="Palatino"/>
+          <w:b w:val="0"/>
+          <w:sz w:val="20"/>
+        </w:rPr>
+        <w:t xml:space="preserve">, 148, 33104–33117).</w:t>
       </w:r>
     </w:p>
     <w:p>
@@ -767,7 +809,7 @@
       </w:pPr>
       <w:r>
         <w:rPr>
-          <w:rFonts w:ascii="Arial" w:hAnsi="Arial"/>
+          <w:rFonts w:ascii="Palatino" w:hAnsi="Palatino" w:eastAsia="Palatino" w:cs="Palatino"/>
           <w:b w:val="0"/>
           <w:sz w:val="20"/>
         </w:rPr>
@@ -775,7 +817,7 @@
       </w:r>
       <w:r>
         <w:rPr>
-          <w:rFonts w:ascii="Arial" w:hAnsi="Arial"/>
+          <w:rFonts w:ascii="Palatino" w:hAnsi="Palatino" w:eastAsia="Palatino" w:cs="Palatino"/>
           <w:b w:val="0"/>
           <w:sz w:val="20"/>
           <w:i w:val="1"/>
@@ -784,7 +826,7 @@
       </w:r>
       <w:r>
         <w:rPr>
-          <w:rFonts w:ascii="Arial" w:hAnsi="Arial"/>
+          <w:rFonts w:ascii="Palatino" w:hAnsi="Palatino" w:eastAsia="Palatino" w:cs="Palatino"/>
           <w:b w:val="0"/>
           <w:sz w:val="20"/>
         </w:rPr>
@@ -792,7 +834,7 @@
       </w:r>
       <w:r>
         <w:rPr>
-          <w:rFonts w:ascii="Arial" w:hAnsi="Arial"/>
+          <w:rFonts w:ascii="Palatino" w:hAnsi="Palatino" w:eastAsia="Palatino" w:cs="Palatino"/>
           <w:b w:val="0"/>
           <w:sz w:val="20"/>
           <w:i w:val="1"/>
@@ -802,11 +844,27 @@
       </w:r>
       <w:r>
         <w:rPr>
-          <w:rFonts w:ascii="Arial" w:hAnsi="Arial"/>
+          <w:rFonts w:ascii="Palatino" w:hAnsi="Palatino" w:eastAsia="Palatino" w:cs="Palatino"/>
           <w:b w:val="0"/>
           <w:sz w:val="20"/>
         </w:rPr>
-        <w:t xml:space="preserve"> 2026, 103, 78–100.</w:t>
+        <w:t xml:space="preserve"> </w:t>
+      </w:r>
+      <w:r>
+        <w:rPr>
+          <w:rFonts w:ascii="Palatino" w:hAnsi="Palatino" w:eastAsia="Palatino" w:cs="Palatino"/>
+          <w:b w:val="1"/>
+          <w:sz w:val="20"/>
+        </w:rPr>
+        <w:t xml:space="preserve">2026</w:t>
+      </w:r>
+      <w:r>
+        <w:rPr>
+          <w:rFonts w:ascii="Palatino" w:hAnsi="Palatino" w:eastAsia="Palatino" w:cs="Palatino"/>
+          <w:b w:val="0"/>
+          <w:sz w:val="20"/>
+        </w:rPr>
+        <w:t xml:space="preserve">, 103, 78–100.</w:t>
       </w:r>
     </w:p>
     <w:p>
@@ -827,7 +885,7 @@
       </w:pPr>
       <w:r>
         <w:rPr>
-          <w:rFonts w:eastAsia="Arial" w:cs="Arial"/>
+          <w:rFonts w:eastAsia="Palatino" w:cs="Palatino" w:ascii="Palatino" w:hAnsi="Palatino"/>
           <w:sz w:val="20"/>
           <w:szCs w:val="20"/>
           <w:color w:val="292D32"/>
@@ -836,7 +894,7 @@
       </w:r>
       <w:r>
         <w:rPr>
-          <w:rFonts w:eastAsia="Arial" w:cs="Arial"/>
+          <w:rFonts w:eastAsia="Palatino" w:cs="Palatino" w:ascii="Palatino" w:hAnsi="Palatino"/>
           <w:sz w:val="20"/>
           <w:szCs w:val="20"/>
           <w:color w:val="292D32"/>
@@ -845,7 +903,7 @@
       </w:r>
       <w:r>
         <w:rPr>
-          <w:rFonts w:eastAsia="Arial" w:cs="Arial"/>
+          <w:rFonts w:eastAsia="Palatino" w:cs="Palatino" w:ascii="Palatino" w:hAnsi="Palatino"/>
           <w:sz w:val="20"/>
           <w:szCs w:val="20"/>
           <w:color w:val="292D32"/>
@@ -855,7 +913,7 @@
       <w:proofErr w:type="spellStart"/>
       <w:r>
         <w:rPr>
-          <w:rFonts w:eastAsia="Arial" w:cs="Arial"/>
+          <w:rFonts w:eastAsia="Palatino" w:cs="Palatino" w:ascii="Palatino" w:hAnsi="Palatino"/>
           <w:sz w:val="20"/>
           <w:szCs w:val="20"/>
           <w:color w:val="292D32"/>
@@ -865,7 +923,7 @@
       <w:proofErr w:type="spellEnd"/>
       <w:r>
         <w:rPr>
-          <w:rFonts w:eastAsia="Arial" w:cs="Arial"/>
+          <w:rFonts w:eastAsia="Palatino" w:cs="Palatino" w:ascii="Palatino" w:hAnsi="Palatino"/>
           <w:sz w:val="20"/>
           <w:szCs w:val="20"/>
           <w:color w:val="292D32"/>
@@ -874,7 +932,7 @@
       </w:r>
       <w:r>
         <w:rPr>
-          <w:rFonts w:eastAsia="Arial" w:cs="Arial"/>
+          <w:rFonts w:eastAsia="Palatino" w:cs="Palatino" w:ascii="Palatino" w:hAnsi="Palatino"/>
           <w:sz w:val="20"/>
           <w:szCs w:val="20"/>
           <w:color w:val="292D32"/>
@@ -883,7 +941,7 @@
       </w:r>
       <w:r>
         <w:rPr>
-          <w:rFonts w:eastAsia="Arial" w:cs="Arial"/>
+          <w:rFonts w:eastAsia="Palatino" w:cs="Palatino" w:ascii="Palatino" w:hAnsi="Palatino"/>
           <w:sz w:val="20"/>
           <w:szCs w:val="20"/>
           <w:color w:val="292D32"/>
@@ -892,7 +950,7 @@
       </w:r>
       <w:r>
         <w:rPr>
-          <w:rFonts w:eastAsia="Arial" w:cs="Arial"/>
+          <w:rFonts w:eastAsia="Palatino" w:cs="Palatino" w:ascii="Palatino" w:hAnsi="Palatino"/>
           <w:sz w:val="20"/>
           <w:szCs w:val="20"/>
           <w:color w:val="292D32"/>
@@ -901,7 +959,7 @@
       </w:r>
       <w:r>
         <w:rPr>
-          <w:rFonts w:eastAsia="Arial" w:cs="Arial"/>
+          <w:rFonts w:eastAsia="Palatino" w:cs="Palatino" w:ascii="Palatino" w:hAnsi="Palatino"/>
           <w:i/>
           <w:iCs/>
           <w:sz w:val="20"/>
@@ -912,7 +970,7 @@
       </w:r>
       <w:r>
         <w:rPr>
-          <w:rFonts w:eastAsia="Arial" w:cs="Arial"/>
+          <w:rFonts w:eastAsia="Palatino" w:cs="Palatino" w:ascii="Palatino" w:hAnsi="Palatino"/>
           <w:i w:val="1"/>
           <w:iCs/>
           <w:sz w:val="20"/>
@@ -923,7 +981,7 @@
       </w:r>
       <w:r>
         <w:rPr>
-          <w:rFonts w:eastAsia="Arial" w:cs="Arial"/>
+          <w:rFonts w:eastAsia="Palatino" w:cs="Palatino" w:ascii="Palatino" w:hAnsi="Palatino"/>
           <w:i/>
           <w:iCs/>
           <w:sz w:val="20"/>
@@ -934,7 +992,7 @@
       </w:r>
       <w:r>
         <w:rPr>
-          <w:rFonts w:eastAsia="Arial" w:cs="Arial"/>
+          <w:rFonts w:eastAsia="Palatino" w:cs="Palatino" w:ascii="Palatino" w:hAnsi="Palatino"/>
           <w:sz w:val="20"/>
           <w:szCs w:val="20"/>
           <w:color w:val="292D32"/>
@@ -943,7 +1001,7 @@
       </w:r>
       <w:r>
         <w:rPr>
-          <w:rFonts w:eastAsia="Arial" w:cs="Arial"/>
+          <w:rFonts w:eastAsia="Palatino" w:cs="Palatino" w:ascii="Palatino" w:hAnsi="Palatino"/>
           <w:sz w:val="20"/>
           <w:szCs w:val="20"/>
           <w:color w:val="292D32"/>
@@ -952,7 +1010,7 @@
       </w:r>
       <w:r>
         <w:rPr>
-          <w:rFonts w:eastAsia="Arial" w:cs="Arial"/>
+          <w:rFonts w:eastAsia="Palatino" w:cs="Palatino" w:ascii="Palatino" w:hAnsi="Palatino"/>
           <w:i w:val="1"/>
           <w:iCs/>
           <w:sz w:val="20"/>
@@ -963,7 +1021,7 @@
       </w:r>
       <w:r>
         <w:rPr>
-          <w:rFonts w:eastAsia="Arial" w:cs="Arial"/>
+          <w:rFonts w:eastAsia="Palatino" w:cs="Palatino" w:ascii="Palatino" w:hAnsi="Palatino"/>
           <w:sz w:val="20"/>
           <w:szCs w:val="20"/>
           <w:color w:val="292D32"/>
@@ -972,7 +1030,7 @@
       </w:r>
       <w:r>
         <w:rPr>
-          <w:rFonts w:eastAsia="Arial" w:cs="Arial"/>
+          <w:rFonts w:eastAsia="Palatino" w:cs="Palatino" w:ascii="Palatino" w:hAnsi="Palatino"/>
           <w:sz w:val="20"/>
           <w:szCs w:val="20"/>
           <w:color w:val="292D32"/>
@@ -981,7 +1039,7 @@
       </w:r>
       <w:r>
         <w:rPr>
-          <w:rFonts w:eastAsia="Arial" w:cs="Arial"/>
+          <w:rFonts w:eastAsia="Palatino" w:cs="Palatino" w:ascii="Palatino" w:hAnsi="Palatino"/>
           <w:i w:val="1"/>
           <w:iCs/>
           <w:sz w:val="20"/>
@@ -992,7 +1050,7 @@
       </w:r>
       <w:r>
         <w:rPr>
-          <w:rFonts w:eastAsia="Arial" w:cs="Arial"/>
+          <w:rFonts w:eastAsia="Palatino" w:cs="Palatino" w:ascii="Palatino" w:hAnsi="Palatino"/>
           <w:sz w:val="20"/>
           <w:szCs w:val="20"/>
           <w:color w:val="292D32"/>
@@ -1001,7 +1059,7 @@
       </w:r>
       <w:r>
         <w:rPr>
-          <w:rFonts w:eastAsia="Arial" w:cs="Arial"/>
+          <w:rFonts w:eastAsia="Palatino" w:cs="Palatino" w:ascii="Palatino" w:hAnsi="Palatino"/>
           <w:sz w:val="20"/>
           <w:szCs w:val="20"/>
           <w:color w:val="292D32"/>
@@ -1010,7 +1068,7 @@
       </w:r>
       <w:r>
         <w:rPr>
-          <w:rFonts w:eastAsia="Arial" w:cs="Arial"/>
+          <w:rFonts w:eastAsia="Palatino" w:cs="Palatino" w:ascii="Palatino" w:hAnsi="Palatino"/>
           <w:sz w:val="20"/>
           <w:szCs w:val="20"/>
           <w:color w:val="292D32"/>
@@ -1036,7 +1094,7 @@
       </w:pPr>
       <w:r>
         <w:rPr>
-          <w:rFonts w:ascii="Arial" w:hAnsi="Arial"/>
+          <w:rFonts w:ascii="Palatino" w:hAnsi="Palatino" w:eastAsia="Palatino" w:cs="Palatino"/>
           <w:b w:val="0"/>
           <w:sz w:val="20"/>
         </w:rPr>
@@ -1044,7 +1102,7 @@
       </w:r>
       <w:r>
         <w:rPr>
-          <w:rFonts w:ascii="Arial" w:hAnsi="Arial"/>
+          <w:rFonts w:ascii="Palatino" w:hAnsi="Palatino" w:eastAsia="Palatino" w:cs="Palatino"/>
           <w:b w:val="0"/>
           <w:sz w:val="20"/>
           <w:i w:val="1"/>
@@ -1053,7 +1111,7 @@
       </w:r>
       <w:r>
         <w:rPr>
-          <w:rFonts w:ascii="Arial" w:hAnsi="Arial"/>
+          <w:rFonts w:ascii="Palatino" w:hAnsi="Palatino" w:eastAsia="Palatino" w:cs="Palatino"/>
           <w:b w:val="0"/>
           <w:sz w:val="20"/>
         </w:rPr>
@@ -1061,7 +1119,7 @@
       </w:r>
       <w:r>
         <w:rPr>
-          <w:rFonts w:ascii="Arial" w:hAnsi="Arial"/>
+          <w:rFonts w:ascii="Palatino" w:hAnsi="Palatino" w:eastAsia="Palatino" w:cs="Palatino"/>
           <w:b w:val="0"/>
           <w:sz w:val="20"/>
           <w:i w:val="1"/>
@@ -1071,11 +1129,27 @@
       </w:r>
       <w:r>
         <w:rPr>
-          <w:rFonts w:ascii="Arial" w:hAnsi="Arial"/>
+          <w:rFonts w:ascii="Palatino" w:hAnsi="Palatino" w:eastAsia="Palatino" w:cs="Palatino"/>
           <w:b w:val="0"/>
           <w:sz w:val="20"/>
         </w:rPr>
-        <w:t xml:space="preserve"> 2024, 14, 13156–13162).</w:t>
+        <w:t xml:space="preserve"> </w:t>
+      </w:r>
+      <w:r>
+        <w:rPr>
+          <w:rFonts w:ascii="Palatino" w:hAnsi="Palatino" w:eastAsia="Palatino" w:cs="Palatino"/>
+          <w:b w:val="1"/>
+          <w:sz w:val="20"/>
+        </w:rPr>
+        <w:t xml:space="preserve">2024</w:t>
+      </w:r>
+      <w:r>
+        <w:rPr>
+          <w:rFonts w:ascii="Palatino" w:hAnsi="Palatino" w:eastAsia="Palatino" w:cs="Palatino"/>
+          <w:b w:val="0"/>
+          <w:sz w:val="20"/>
+        </w:rPr>
+        <w:t xml:space="preserve">, 14, 13156–13162).</w:t>
       </w:r>
     </w:p>
     <w:p>
@@ -1096,7 +1170,7 @@
       </w:pPr>
       <w:r>
         <w:rPr>
-          <w:rFonts w:ascii="Arial" w:hAnsi="Arial"/>
+          <w:rFonts w:ascii="Palatino" w:hAnsi="Palatino" w:eastAsia="Palatino" w:cs="Palatino"/>
           <w:b w:val="0"/>
           <w:sz w:val="20"/>
         </w:rPr>
@@ -1117,7 +1191,7 @@
       </w:pPr>
       <w:r>
         <w:rPr>
-          <w:rFonts w:eastAsia="Arial" w:cs="Arial"/>
+          <w:rFonts w:eastAsia="Palatino" w:cs="Palatino" w:ascii="Palatino" w:hAnsi="Palatino"/>
           <w:sz w:val="20"/>
           <w:szCs w:val="20"/>
           <w:b/>
@@ -1127,7 +1201,7 @@
       </w:r>
       <w:r>
         <w:rPr>
-          <w:rFonts w:eastAsia="Arial" w:cs="Arial"/>
+          <w:rFonts w:eastAsia="Palatino" w:cs="Palatino" w:ascii="Palatino" w:hAnsi="Palatino"/>
           <w:b w:val="0"/>
           <w:bCs/>
           <w:i/>
@@ -1140,7 +1214,7 @@
       </w:r>
       <w:r>
         <w:rPr>
-          <w:rFonts w:eastAsia="Arial" w:cs="Arial"/>
+          <w:rFonts w:eastAsia="Palatino" w:cs="Palatino" w:ascii="Palatino" w:hAnsi="Palatino"/>
           <w:b w:val="0"/>
           <w:i/>
           <w:iCs/>
@@ -1152,7 +1226,7 @@
       </w:r>
       <w:r>
         <w:rPr>
-          <w:rFonts w:eastAsia="Arial" w:cs="Arial"/>
+          <w:rFonts w:eastAsia="Palatino" w:cs="Palatino" w:ascii="Palatino" w:hAnsi="Palatino"/>
           <w:b w:val="0"/>
           <w:i w:val="0"/>
           <w:iCs/>
@@ -1164,7 +1238,19 @@
       </w:r>
       <w:r>
         <w:rPr>
-          <w:rFonts w:eastAsia="Arial" w:cs="Arial"/>
+          <w:rFonts w:eastAsia="Palatino" w:cs="Palatino" w:ascii="Palatino" w:hAnsi="Palatino"/>
+          <w:b w:val="1"/>
+          <w:i w:val="0"/>
+          <w:iCs/>
+          <w:color w:val="606A74"/>
+          <w:sz w:val="20"/>
+          <w:szCs w:val="20"/>
+        </w:rPr>
+        <w:t xml:space="preserve">2019</w:t>
+      </w:r>
+      <w:r>
+        <w:rPr>
+          <w:rFonts w:eastAsia="Palatino" w:cs="Palatino" w:ascii="Palatino" w:hAnsi="Palatino"/>
           <w:b w:val="0"/>
           <w:i w:val="0"/>
           <w:iCs/>
@@ -1172,7 +1258,19 @@
           <w:sz w:val="20"/>
           <w:szCs w:val="20"/>
         </w:rPr>
-        <w:t xml:space="preserve">2019 – 2020</w:t>
+        <w:t xml:space="preserve"> – </w:t>
+      </w:r>
+      <w:r>
+        <w:rPr>
+          <w:rFonts w:eastAsia="Palatino" w:cs="Palatino" w:ascii="Palatino" w:hAnsi="Palatino"/>
+          <w:b w:val="1"/>
+          <w:i w:val="0"/>
+          <w:iCs/>
+          <w:color w:val="606A74"/>
+          <w:sz w:val="20"/>
+          <w:szCs w:val="20"/>
+        </w:rPr>
+        <w:t xml:space="preserve">2020</w:t>
       </w:r>
     </w:p>
     <w:p>
@@ -1193,7 +1291,7 @@
       </w:pPr>
       <w:r>
         <w:rPr>
-          <w:rFonts w:ascii="Arial" w:hAnsi="Arial"/>
+          <w:rFonts w:ascii="Palatino" w:hAnsi="Palatino" w:eastAsia="Palatino" w:cs="Palatino"/>
           <w:b w:val="0"/>
           <w:sz w:val="20"/>
         </w:rPr>
@@ -1201,7 +1299,7 @@
       </w:r>
       <w:r>
         <w:rPr>
-          <w:rFonts w:ascii="Arial" w:hAnsi="Arial"/>
+          <w:rFonts w:ascii="Palatino" w:hAnsi="Palatino" w:eastAsia="Palatino" w:cs="Palatino"/>
           <w:b w:val="0"/>
           <w:sz w:val="20"/>
           <w:i w:val="1"/>
@@ -1211,11 +1309,27 @@
       </w:r>
       <w:r>
         <w:rPr>
-          <w:rFonts w:ascii="Arial" w:hAnsi="Arial"/>
+          <w:rFonts w:ascii="Palatino" w:hAnsi="Palatino" w:eastAsia="Palatino" w:cs="Palatino"/>
           <w:b w:val="0"/>
           <w:sz w:val="20"/>
         </w:rPr>
-        <w:t xml:space="preserve"> 2020, 26, 3703–3708).</w:t>
+        <w:t xml:space="preserve"> </w:t>
+      </w:r>
+      <w:r>
+        <w:rPr>
+          <w:rFonts w:ascii="Palatino" w:hAnsi="Palatino" w:eastAsia="Palatino" w:cs="Palatino"/>
+          <w:b w:val="1"/>
+          <w:sz w:val="20"/>
+        </w:rPr>
+        <w:t xml:space="preserve">2020</w:t>
+      </w:r>
+      <w:r>
+        <w:rPr>
+          <w:rFonts w:ascii="Palatino" w:hAnsi="Palatino" w:eastAsia="Palatino" w:cs="Palatino"/>
+          <w:b w:val="0"/>
+          <w:sz w:val="20"/>
+        </w:rPr>
+        <w:t xml:space="preserve">, 26, 3703–3708).</w:t>
       </w:r>
     </w:p>
     <w:p>
@@ -1232,7 +1346,7 @@
       </w:pPr>
       <w:r>
         <w:rPr>
-          <w:rFonts w:eastAsia="Arial" w:cs="Arial"/>
+          <w:rFonts w:eastAsia="Palatino" w:cs="Palatino" w:ascii="Palatino" w:hAnsi="Palatino"/>
           <w:sz w:val="20"/>
           <w:szCs w:val="20"/>
           <w:b/>
@@ -1242,7 +1356,7 @@
       </w:r>
       <w:r>
         <w:rPr>
-          <w:rFonts w:eastAsia="Arial" w:cs="Arial"/>
+          <w:rFonts w:eastAsia="Palatino" w:cs="Palatino" w:ascii="Palatino" w:hAnsi="Palatino"/>
           <w:b w:val="0"/>
           <w:bCs/>
           <w:i/>
@@ -1255,7 +1369,7 @@
       </w:r>
       <w:r>
         <w:rPr>
-          <w:rFonts w:eastAsia="Arial" w:cs="Arial"/>
+          <w:rFonts w:eastAsia="Palatino" w:cs="Palatino" w:ascii="Palatino" w:hAnsi="Palatino"/>
           <w:color w:val="606A74"/>
           <w:sz w:val="20"/>
           <w:szCs w:val="20"/>
@@ -1266,7 +1380,7 @@
       </w:r>
       <w:r>
         <w:rPr>
-          <w:rFonts w:eastAsia="Arial" w:cs="Arial"/>
+          <w:rFonts w:eastAsia="Palatino" w:cs="Palatino" w:ascii="Palatino" w:hAnsi="Palatino"/>
           <w:b w:val="0"/>
           <w:i w:val="0"/>
           <w:iCs/>
@@ -1274,7 +1388,43 @@
           <w:sz w:val="20"/>
           <w:szCs w:val="20"/>
         </w:rPr>
-        <w:t xml:space="preserve">May 2019 – July 2019</w:t>
+        <w:t xml:space="preserve">May </w:t>
+      </w:r>
+      <w:r>
+        <w:rPr>
+          <w:rFonts w:eastAsia="Palatino" w:cs="Palatino" w:ascii="Palatino" w:hAnsi="Palatino"/>
+          <w:b w:val="1"/>
+          <w:i w:val="0"/>
+          <w:iCs/>
+          <w:color w:val="606A74"/>
+          <w:sz w:val="20"/>
+          <w:szCs w:val="20"/>
+        </w:rPr>
+        <w:t xml:space="preserve">2019</w:t>
+      </w:r>
+      <w:r>
+        <w:rPr>
+          <w:rFonts w:eastAsia="Palatino" w:cs="Palatino" w:ascii="Palatino" w:hAnsi="Palatino"/>
+          <w:b w:val="0"/>
+          <w:i w:val="0"/>
+          <w:iCs/>
+          <w:color w:val="606A74"/>
+          <w:sz w:val="20"/>
+          <w:szCs w:val="20"/>
+        </w:rPr>
+        <w:t xml:space="preserve"> – July </w:t>
+      </w:r>
+      <w:r>
+        <w:rPr>
+          <w:rFonts w:eastAsia="Palatino" w:cs="Palatino" w:ascii="Palatino" w:hAnsi="Palatino"/>
+          <w:b w:val="1"/>
+          <w:i w:val="0"/>
+          <w:iCs/>
+          <w:color w:val="606A74"/>
+          <w:sz w:val="20"/>
+          <w:szCs w:val="20"/>
+        </w:rPr>
+        <w:t xml:space="preserve">2019</w:t>
       </w:r>
     </w:p>
     <w:p>
@@ -1295,7 +1445,7 @@
       </w:pPr>
       <w:r>
         <w:rPr>
-          <w:rFonts w:ascii="Arial" w:hAnsi="Arial"/>
+          <w:rFonts w:ascii="Palatino" w:hAnsi="Palatino" w:eastAsia="Palatino" w:cs="Palatino"/>
           <w:b w:val="0"/>
           <w:sz w:val="20"/>
         </w:rPr>
@@ -1303,7 +1453,7 @@
       </w:r>
       <w:r>
         <w:rPr>
-          <w:rFonts w:ascii="Arial" w:hAnsi="Arial"/>
+          <w:rFonts w:ascii="Palatino" w:hAnsi="Palatino" w:eastAsia="Palatino" w:cs="Palatino"/>
           <w:b w:val="0"/>
           <w:sz w:val="20"/>
           <w:i w:val="1"/>
@@ -1313,11 +1463,27 @@
       </w:r>
       <w:r>
         <w:rPr>
-          <w:rFonts w:ascii="Arial" w:hAnsi="Arial"/>
+          <w:rFonts w:ascii="Palatino" w:hAnsi="Palatino" w:eastAsia="Palatino" w:cs="Palatino"/>
           <w:b w:val="0"/>
           <w:sz w:val="20"/>
         </w:rPr>
-        <w:t xml:space="preserve"> 2021, 32, 929–935).</w:t>
+        <w:t xml:space="preserve"> </w:t>
+      </w:r>
+      <w:r>
+        <w:rPr>
+          <w:rFonts w:ascii="Palatino" w:hAnsi="Palatino" w:eastAsia="Palatino" w:cs="Palatino"/>
+          <w:b w:val="1"/>
+          <w:sz w:val="20"/>
+        </w:rPr>
+        <w:t xml:space="preserve">2021</w:t>
+      </w:r>
+      <w:r>
+        <w:rPr>
+          <w:rFonts w:ascii="Palatino" w:hAnsi="Palatino" w:eastAsia="Palatino" w:cs="Palatino"/>
+          <w:b w:val="0"/>
+          <w:sz w:val="20"/>
+        </w:rPr>
+        <w:t xml:space="preserve">, 32, 929–935).</w:t>
       </w:r>
     </w:p>
     <w:p>
@@ -1334,7 +1500,7 @@
       </w:pPr>
       <w:r>
         <w:rPr>
-          <w:rFonts w:eastAsia="Arial" w:cs="Arial"/>
+          <w:rFonts w:eastAsia="Palatino" w:cs="Palatino" w:ascii="Palatino" w:hAnsi="Palatino"/>
           <w:sz w:val="20"/>
           <w:szCs w:val="20"/>
           <w:b/>
@@ -1344,7 +1510,7 @@
       </w:r>
       <w:r>
         <w:rPr>
-          <w:rFonts w:eastAsia="Arial" w:cs="Arial"/>
+          <w:rFonts w:eastAsia="Palatino" w:cs="Palatino" w:ascii="Palatino" w:hAnsi="Palatino"/>
           <w:b w:val="0"/>
           <w:bCs/>
           <w:i/>
@@ -1357,7 +1523,7 @@
       </w:r>
       <w:r>
         <w:rPr>
-          <w:rFonts w:eastAsia="Arial" w:cs="Arial"/>
+          <w:rFonts w:eastAsia="Palatino" w:cs="Palatino" w:ascii="Palatino" w:hAnsi="Palatino"/>
           <w:b w:val="0"/>
           <w:bCs/>
           <w:i w:val="0"/>
@@ -1370,7 +1536,7 @@
       </w:r>
       <w:r>
         <w:rPr>
-          <w:rFonts w:eastAsia="Arial" w:cs="Arial"/>
+          <w:rFonts w:eastAsia="Palatino" w:cs="Palatino" w:ascii="Palatino" w:hAnsi="Palatino"/>
           <w:b w:val="0"/>
           <w:i w:val="0"/>
           <w:iCs/>
@@ -1378,7 +1544,43 @@
           <w:sz w:val="20"/>
           <w:szCs w:val="20"/>
         </w:rPr>
-        <w:t xml:space="preserve">May 2018 – July 2018</w:t>
+        <w:t xml:space="preserve">May </w:t>
+      </w:r>
+      <w:r>
+        <w:rPr>
+          <w:rFonts w:eastAsia="Palatino" w:cs="Palatino" w:ascii="Palatino" w:hAnsi="Palatino"/>
+          <w:b w:val="1"/>
+          <w:i w:val="0"/>
+          <w:iCs/>
+          <w:color w:val="606A74"/>
+          <w:sz w:val="20"/>
+          <w:szCs w:val="20"/>
+        </w:rPr>
+        <w:t xml:space="preserve">2018</w:t>
+      </w:r>
+      <w:r>
+        <w:rPr>
+          <w:rFonts w:eastAsia="Palatino" w:cs="Palatino" w:ascii="Palatino" w:hAnsi="Palatino"/>
+          <w:b w:val="0"/>
+          <w:i w:val="0"/>
+          <w:iCs/>
+          <w:color w:val="606A74"/>
+          <w:sz w:val="20"/>
+          <w:szCs w:val="20"/>
+        </w:rPr>
+        <w:t xml:space="preserve"> – July </w:t>
+      </w:r>
+      <w:r>
+        <w:rPr>
+          <w:rFonts w:eastAsia="Palatino" w:cs="Palatino" w:ascii="Palatino" w:hAnsi="Palatino"/>
+          <w:b w:val="1"/>
+          <w:i w:val="0"/>
+          <w:iCs/>
+          <w:color w:val="606A74"/>
+          <w:sz w:val="20"/>
+          <w:szCs w:val="20"/>
+        </w:rPr>
+        <w:t xml:space="preserve">2018</w:t>
       </w:r>
     </w:p>
     <w:p>
@@ -1399,7 +1601,7 @@
       </w:pPr>
       <w:r>
         <w:rPr>
-          <w:rFonts w:eastAsia="Arial" w:cs="Arial"/>
+          <w:rFonts w:eastAsia="Palatino" w:cs="Palatino" w:ascii="Palatino" w:hAnsi="Palatino"/>
           <w:sz w:val="20"/>
           <w:szCs w:val="20"/>
           <w:color w:val="292D32"/>
@@ -1408,7 +1610,7 @@
       </w:r>
       <w:r>
         <w:rPr>
-          <w:rFonts w:eastAsia="Arial" w:cs="Arial"/>
+          <w:rFonts w:eastAsia="Palatino" w:cs="Palatino" w:ascii="Palatino" w:hAnsi="Palatino"/>
           <w:i w:val="1"/>
           <w:iCs/>
           <w:sz w:val="20"/>
@@ -1420,7 +1622,7 @@
       </w:r>
       <w:r>
         <w:rPr>
-          <w:rFonts w:eastAsia="Arial" w:cs="Arial"/>
+          <w:rFonts w:eastAsia="Palatino" w:cs="Palatino" w:ascii="Palatino" w:hAnsi="Palatino"/>
           <w:i/>
           <w:iCs/>
           <w:sz w:val="20"/>
@@ -1431,17 +1633,28 @@
       </w:r>
       <w:r>
         <w:rPr>
-          <w:rFonts w:eastAsia="Arial" w:cs="Arial"/>
-          <w:bCs/>
-          <w:sz w:val="20"/>
-          <w:szCs w:val="20"/>
-          <w:color w:val="292D32"/>
-        </w:rPr>
-        <w:t xml:space="preserve">2021, </w:t>
-      </w:r>
-      <w:r>
-        <w:rPr>
-          <w:rFonts w:eastAsia="Arial" w:cs="Arial"/>
+          <w:rFonts w:eastAsia="Palatino" w:cs="Palatino" w:ascii="Palatino" w:hAnsi="Palatino"/>
+          <w:bCs/>
+          <w:sz w:val="20"/>
+          <w:szCs w:val="20"/>
+          <w:color w:val="292D32"/>
+          <w:b w:val="1"/>
+        </w:rPr>
+        <w:t xml:space="preserve">2021</w:t>
+      </w:r>
+      <w:r>
+        <w:rPr>
+          <w:rFonts w:eastAsia="Palatino" w:cs="Palatino" w:ascii="Palatino" w:hAnsi="Palatino"/>
+          <w:bCs/>
+          <w:sz w:val="20"/>
+          <w:szCs w:val="20"/>
+          <w:color w:val="292D32"/>
+        </w:rPr>
+        <w:t xml:space="preserve">, </w:t>
+      </w:r>
+      <w:r>
+        <w:rPr>
+          <w:rFonts w:eastAsia="Palatino" w:cs="Palatino" w:ascii="Palatino" w:hAnsi="Palatino"/>
           <w:i/>
           <w:iCs/>
           <w:sz w:val="20"/>
@@ -1452,7 +1665,7 @@
       </w:r>
       <w:r>
         <w:rPr>
-          <w:rFonts w:eastAsia="Arial" w:cs="Arial"/>
+          <w:rFonts w:eastAsia="Palatino" w:cs="Palatino" w:ascii="Palatino" w:hAnsi="Palatino"/>
           <w:sz w:val="20"/>
           <w:szCs w:val="20"/>
           <w:color w:val="292D32"/>
@@ -1474,7 +1687,7 @@
       </w:pPr>
       <w:r>
         <w:rPr>
-          <w:rFonts w:eastAsia="Arial" w:cs="Arial"/>
+          <w:rFonts w:eastAsia="Palatino" w:cs="Palatino" w:ascii="Palatino" w:hAnsi="Palatino"/>
           <w:sz w:val="20"/>
           <w:szCs w:val="20"/>
           <w:b/>
@@ -1484,7 +1697,7 @@
       </w:r>
       <w:r>
         <w:rPr>
-          <w:rFonts w:eastAsia="Arial" w:cs="Arial"/>
+          <w:rFonts w:eastAsia="Palatino" w:cs="Palatino" w:ascii="Palatino" w:hAnsi="Palatino"/>
           <w:b w:val="0"/>
           <w:bCs/>
           <w:i/>
@@ -1497,7 +1710,7 @@
       </w:r>
       <w:r>
         <w:rPr>
-          <w:rFonts w:eastAsia="Arial" w:cs="Arial"/>
+          <w:rFonts w:eastAsia="Palatino" w:cs="Palatino" w:ascii="Palatino" w:hAnsi="Palatino"/>
           <w:b w:val="0"/>
           <w:bCs/>
           <w:i/>
@@ -1510,7 +1723,7 @@
       </w:r>
       <w:r>
         <w:rPr>
-          <w:rFonts w:eastAsia="Arial" w:cs="Arial"/>
+          <w:rFonts w:eastAsia="Palatino" w:cs="Palatino" w:ascii="Palatino" w:hAnsi="Palatino"/>
           <w:b w:val="0"/>
           <w:bCs/>
           <w:i/>
@@ -1523,7 +1736,7 @@
       </w:r>
       <w:r>
         <w:rPr>
-          <w:rFonts w:eastAsia="Arial" w:cs="Arial"/>
+          <w:rFonts w:eastAsia="Palatino" w:cs="Palatino" w:ascii="Palatino" w:hAnsi="Palatino"/>
           <w:b w:val="0"/>
           <w:bCs/>
           <w:i w:val="0"/>
@@ -1536,7 +1749,7 @@
       </w:r>
       <w:r>
         <w:rPr>
-          <w:rFonts w:eastAsia="Arial" w:cs="Arial"/>
+          <w:rFonts w:eastAsia="Palatino" w:cs="Palatino" w:ascii="Palatino" w:hAnsi="Palatino"/>
           <w:b w:val="0"/>
           <w:i w:val="0"/>
           <w:iCs/>
@@ -1544,7 +1757,43 @@
           <w:sz w:val="20"/>
           <w:szCs w:val="20"/>
         </w:rPr>
-        <w:t xml:space="preserve">May 2017– July 2017</w:t>
+        <w:t xml:space="preserve">May </w:t>
+      </w:r>
+      <w:r>
+        <w:rPr>
+          <w:rFonts w:eastAsia="Palatino" w:cs="Palatino" w:ascii="Palatino" w:hAnsi="Palatino"/>
+          <w:b w:val="1"/>
+          <w:i w:val="0"/>
+          <w:iCs/>
+          <w:color w:val="606A74"/>
+          <w:sz w:val="20"/>
+          <w:szCs w:val="20"/>
+        </w:rPr>
+        <w:t xml:space="preserve">2017</w:t>
+      </w:r>
+      <w:r>
+        <w:rPr>
+          <w:rFonts w:eastAsia="Palatino" w:cs="Palatino" w:ascii="Palatino" w:hAnsi="Palatino"/>
+          <w:b w:val="0"/>
+          <w:i w:val="0"/>
+          <w:iCs/>
+          <w:color w:val="606A74"/>
+          <w:sz w:val="20"/>
+          <w:szCs w:val="20"/>
+        </w:rPr>
+        <w:t xml:space="preserve">– July </w:t>
+      </w:r>
+      <w:r>
+        <w:rPr>
+          <w:rFonts w:eastAsia="Palatino" w:cs="Palatino" w:ascii="Palatino" w:hAnsi="Palatino"/>
+          <w:b w:val="1"/>
+          <w:i w:val="0"/>
+          <w:iCs/>
+          <w:color w:val="606A74"/>
+          <w:sz w:val="20"/>
+          <w:szCs w:val="20"/>
+        </w:rPr>
+        <w:t xml:space="preserve">2017</w:t>
       </w:r>
     </w:p>
     <w:p>
@@ -1565,7 +1814,7 @@
       </w:pPr>
       <w:r>
         <w:rPr>
-          <w:rFonts w:ascii="Arial" w:hAnsi="Arial"/>
+          <w:rFonts w:ascii="Palatino" w:hAnsi="Palatino" w:eastAsia="Palatino" w:cs="Palatino"/>
           <w:sz w:val="20"/>
         </w:rPr>
         <w:t xml:space="preserve">Synthesized a hexatopic triptycene hexa-acid linker and investigated metal-assisted self-assembly into honeycomb-structured metal–organic frameworks (MOFs).</w:t>
@@ -1588,7 +1837,7 @@
       </w:pPr>
       <w:r>
         <w:rPr>
-          <w:rFonts w:eastAsia="Arial" w:cs="Arial"/>
+          <w:rFonts w:eastAsia="Arial" w:cs="Arial" w:ascii="Arial" w:hAnsi="Arial"/>
           <w:color w:val="253D50"/>
           <w:sz w:val="21"/>
           <w:b/>
@@ -1598,7 +1847,7 @@
       </w:r>
       <w:r>
         <w:rPr>
-          <w:rFonts w:eastAsia="Arial" w:cs="Arial"/>
+          <w:rFonts w:eastAsia="Arial" w:cs="Arial" w:ascii="Arial" w:hAnsi="Arial"/>
           <w:color w:val="253D50"/>
           <w:sz w:val="21"/>
           <w:b/>
@@ -1608,7 +1857,7 @@
       </w:r>
       <w:r>
         <w:rPr>
-          <w:rFonts w:eastAsia="Arial" w:cs="Arial"/>
+          <w:rFonts w:eastAsia="Arial" w:cs="Arial" w:ascii="Arial" w:hAnsi="Arial"/>
           <w:color w:val="253D50"/>
           <w:sz w:val="21"/>
           <w:b/>
@@ -1618,7 +1867,7 @@
       </w:r>
       <w:r>
         <w:rPr>
-          <w:rFonts w:eastAsia="Arial" w:cs="Arial"/>
+          <w:rFonts w:eastAsia="Arial" w:cs="Arial" w:ascii="Arial" w:hAnsi="Arial"/>
           <w:color w:val="253D50"/>
           <w:sz w:val="21"/>
           <w:b/>
@@ -1644,8 +1893,8 @@
       </w:pPr>
       <w:r>
         <w:rPr>
-          <w:rFonts w:eastAsia="Arial" w:cs="Arial"/>
-          <w:b/>
+          <w:rFonts w:eastAsia="Palatino" w:cs="Palatino" w:ascii="Palatino" w:hAnsi="Palatino"/>
+          <w:b w:val="1"/>
           <w:bCs/>
           <w:sz w:val="20"/>
           <w:szCs w:val="20"/>
@@ -1655,7 +1904,7 @@
       </w:r>
       <w:r>
         <w:rPr>
-          <w:rFonts w:eastAsia="Arial" w:cs="Arial"/>
+          <w:rFonts w:eastAsia="Palatino" w:cs="Palatino" w:ascii="Palatino" w:hAnsi="Palatino"/>
           <w:sz w:val="20"/>
           <w:szCs w:val="20"/>
           <w:color w:val="292D32"/>
@@ -1664,7 +1913,7 @@
       </w:r>
       <w:r>
         <w:rPr>
-          <w:rFonts w:eastAsia="Arial" w:cs="Arial"/>
+          <w:rFonts w:eastAsia="Palatino" w:cs="Palatino" w:ascii="Palatino" w:hAnsi="Palatino"/>
           <w:sz w:val="20"/>
           <w:szCs w:val="20"/>
           <w:vertAlign w:val="superscript"/>
@@ -1674,7 +1923,7 @@
       </w:r>
       <w:r>
         <w:rPr>
-          <w:rFonts w:eastAsia="Arial" w:cs="Arial"/>
+          <w:rFonts w:eastAsia="Palatino" w:cs="Palatino" w:ascii="Palatino" w:hAnsi="Palatino"/>
           <w:sz w:val="20"/>
           <w:szCs w:val="20"/>
           <w:color w:val="292D32"/>
@@ -1685,7 +1934,7 @@
         <w:r>
           <w:rPr>
             <w:rStyle w:val="Hyperlink"/>
-            <w:rFonts w:eastAsia="Arial" w:cs="Arial"/>
+            <w:rFonts w:eastAsia="Palatino" w:cs="Palatino" w:ascii="Palatino" w:hAnsi="Palatino"/>
             <w:i w:val="1"/>
             <w:iCs/>
             <w:sz w:val="20"/>
@@ -1698,7 +1947,7 @@
         <w:r>
           <w:rPr>
             <w:rStyle w:val="Hyperlink"/>
-            <w:rFonts w:eastAsia="Arial" w:cs="Arial"/>
+            <w:rFonts w:eastAsia="Palatino" w:cs="Palatino" w:ascii="Palatino" w:hAnsi="Palatino"/>
             <w:sz w:val="20"/>
             <w:szCs w:val="20"/>
             <w:color w:val="292D32"/>
@@ -1708,7 +1957,7 @@
         <w:r>
           <w:rPr>
             <w:rStyle w:val="Hyperlink"/>
-            <w:rFonts w:eastAsia="Arial" w:cs="Arial"/>
+            <w:rFonts w:eastAsia="Palatino" w:cs="Palatino" w:ascii="Palatino" w:hAnsi="Palatino"/>
             <w:bCs/>
             <w:sz w:val="20"/>
             <w:szCs w:val="20"/>
@@ -1722,7 +1971,7 @@
         <w:r>
           <w:rPr>
             <w:rStyle w:val="Hyperlink"/>
-            <w:rFonts w:eastAsia="Arial" w:cs="Arial"/>
+            <w:rFonts w:eastAsia="Palatino" w:cs="Palatino" w:ascii="Palatino" w:hAnsi="Palatino"/>
             <w:sz w:val="20"/>
             <w:szCs w:val="20"/>
             <w:color w:val="292D32"/>
@@ -1732,7 +1981,7 @@
         <w:r>
           <w:rPr>
             <w:rStyle w:val="Hyperlink"/>
-            <w:rFonts w:eastAsia="Arial" w:cs="Arial"/>
+            <w:rFonts w:eastAsia="Palatino" w:cs="Palatino" w:ascii="Palatino" w:hAnsi="Palatino"/>
             <w:i/>
             <w:iCs/>
             <w:sz w:val="20"/>
@@ -1744,7 +1993,7 @@
         <w:r>
           <w:rPr>
             <w:rStyle w:val="Hyperlink"/>
-            <w:rFonts w:eastAsia="Arial" w:cs="Arial"/>
+            <w:rFonts w:eastAsia="Palatino" w:cs="Palatino" w:ascii="Palatino" w:hAnsi="Palatino"/>
             <w:i w:val="1"/>
             <w:iCs/>
             <w:sz w:val="20"/>
@@ -1758,7 +2007,7 @@
         <w:r>
           <w:rPr>
             <w:rStyle w:val="Hyperlink"/>
-            <w:rFonts w:eastAsia="Arial" w:cs="Arial"/>
+            <w:rFonts w:eastAsia="Palatino" w:cs="Palatino" w:ascii="Palatino" w:hAnsi="Palatino"/>
             <w:i/>
             <w:iCs/>
             <w:sz w:val="20"/>
@@ -1770,7 +2019,7 @@
         <w:r>
           <w:rPr>
             <w:rStyle w:val="Hyperlink"/>
-            <w:rFonts w:eastAsia="Arial" w:cs="Arial"/>
+            <w:rFonts w:eastAsia="Palatino" w:cs="Palatino" w:ascii="Palatino" w:hAnsi="Palatino"/>
             <w:sz w:val="20"/>
             <w:szCs w:val="20"/>
             <w:color w:val="292D32"/>
@@ -1780,7 +2029,7 @@
       </w:hyperlink>
       <w:r>
         <w:rPr>
-          <w:rFonts w:eastAsia="Arial" w:cs="Arial"/>
+          <w:rFonts w:eastAsia="Palatino" w:cs="Palatino" w:ascii="Palatino" w:hAnsi="Palatino"/>
           <w:i/>
           <w:iCs/>
           <w:sz w:val="20"/>
@@ -1807,8 +2056,8 @@
       </w:pPr>
       <w:r>
         <w:rPr>
-          <w:rFonts w:eastAsia="Arial" w:cs="Arial"/>
-          <w:b/>
+          <w:rFonts w:eastAsia="Palatino" w:cs="Palatino" w:ascii="Palatino" w:hAnsi="Palatino"/>
+          <w:b w:val="1"/>
           <w:bCs/>
           <w:sz w:val="20"/>
           <w:szCs w:val="20"/>
@@ -1818,7 +2067,7 @@
       </w:r>
       <w:r>
         <w:rPr>
-          <w:rFonts w:eastAsia="Arial" w:cs="Arial"/>
+          <w:rFonts w:eastAsia="Palatino" w:cs="Palatino" w:ascii="Palatino" w:hAnsi="Palatino"/>
           <w:sz w:val="20"/>
           <w:szCs w:val="20"/>
           <w:color w:val="292D32"/>
@@ -1827,7 +2076,7 @@
       </w:r>
       <w:r>
         <w:rPr>
-          <w:rFonts w:eastAsia="Arial" w:cs="Arial"/>
+          <w:rFonts w:eastAsia="Palatino" w:cs="Palatino" w:ascii="Palatino" w:hAnsi="Palatino"/>
           <w:sz w:val="20"/>
           <w:szCs w:val="20"/>
           <w:vertAlign w:val="superscript"/>
@@ -1837,7 +2086,7 @@
       </w:r>
       <w:r>
         <w:rPr>
-          <w:rFonts w:eastAsia="Arial" w:cs="Arial"/>
+          <w:rFonts w:eastAsia="Palatino" w:cs="Palatino" w:ascii="Palatino" w:hAnsi="Palatino"/>
           <w:sz w:val="20"/>
           <w:szCs w:val="20"/>
           <w:color w:val="292D32"/>
@@ -1846,7 +2095,7 @@
       </w:r>
       <w:r>
         <w:rPr>
-          <w:rFonts w:eastAsia="Arial" w:cs="Arial"/>
+          <w:rFonts w:eastAsia="Palatino" w:cs="Palatino" w:ascii="Palatino" w:hAnsi="Palatino"/>
           <w:i w:val="1"/>
           <w:iCs/>
           <w:sz w:val="20"/>
@@ -1857,7 +2106,7 @@
       </w:r>
       <w:r>
         <w:rPr>
-          <w:rFonts w:eastAsia="Arial" w:cs="Arial"/>
+          <w:rFonts w:eastAsia="Palatino" w:cs="Palatino" w:ascii="Palatino" w:hAnsi="Palatino"/>
           <w:sz w:val="20"/>
           <w:szCs w:val="20"/>
           <w:color w:val="292D32"/>
@@ -1866,7 +2115,7 @@
       </w:r>
       <w:r>
         <w:rPr>
-          <w:rFonts w:eastAsia="Arial" w:cs="Arial"/>
+          <w:rFonts w:eastAsia="Palatino" w:cs="Palatino" w:ascii="Palatino" w:hAnsi="Palatino"/>
           <w:i/>
           <w:iCs/>
           <w:sz w:val="20"/>
@@ -1879,7 +2128,7 @@
         <w:r>
           <w:rPr>
             <w:rStyle w:val="Hyperlink"/>
-            <w:rFonts w:eastAsia="Arial" w:cs="Arial"/>
+            <w:rFonts w:eastAsia="Palatino" w:cs="Palatino" w:ascii="Palatino" w:hAnsi="Palatino"/>
             <w:i w:val="1"/>
             <w:iCs/>
             <w:sz w:val="20"/>
@@ -1892,7 +2141,7 @@
         <w:r>
           <w:rPr>
             <w:rStyle w:val="Hyperlink"/>
-            <w:rFonts w:eastAsia="Arial" w:cs="Arial"/>
+            <w:rFonts w:eastAsia="Palatino" w:cs="Palatino" w:ascii="Palatino" w:hAnsi="Palatino"/>
             <w:i/>
             <w:iCs/>
             <w:sz w:val="20"/>
@@ -1904,7 +2153,7 @@
         <w:r>
           <w:rPr>
             <w:rStyle w:val="Hyperlink"/>
-            <w:rFonts w:eastAsia="Arial" w:cs="Arial"/>
+            <w:rFonts w:eastAsia="Palatino" w:cs="Palatino" w:ascii="Palatino" w:hAnsi="Palatino"/>
             <w:bCs/>
             <w:sz w:val="20"/>
             <w:szCs w:val="20"/>
@@ -1918,7 +2167,7 @@
         <w:r>
           <w:rPr>
             <w:rStyle w:val="Hyperlink"/>
-            <w:rFonts w:eastAsia="Arial" w:cs="Arial"/>
+            <w:rFonts w:eastAsia="Palatino" w:cs="Palatino" w:ascii="Palatino" w:hAnsi="Palatino"/>
             <w:i/>
             <w:iCs/>
             <w:sz w:val="20"/>
@@ -1930,7 +2179,7 @@
         <w:r>
           <w:rPr>
             <w:rStyle w:val="Hyperlink"/>
-            <w:rFonts w:eastAsia="Arial" w:cs="Arial"/>
+            <w:rFonts w:eastAsia="Palatino" w:cs="Palatino" w:ascii="Palatino" w:hAnsi="Palatino"/>
             <w:i w:val="1"/>
             <w:iCs/>
             <w:sz w:val="20"/>
@@ -1944,7 +2193,7 @@
         <w:r>
           <w:rPr>
             <w:rStyle w:val="Hyperlink"/>
-            <w:rFonts w:eastAsia="Arial" w:cs="Arial"/>
+            <w:rFonts w:eastAsia="Palatino" w:cs="Palatino" w:ascii="Palatino" w:hAnsi="Palatino"/>
             <w:i/>
             <w:iCs/>
             <w:sz w:val="20"/>
@@ -1956,7 +2205,7 @@
         <w:r>
           <w:rPr>
             <w:rStyle w:val="Hyperlink"/>
-            <w:rFonts w:eastAsia="Arial" w:cs="Arial"/>
+            <w:rFonts w:eastAsia="Palatino" w:cs="Palatino" w:ascii="Palatino" w:hAnsi="Palatino"/>
             <w:sz w:val="20"/>
             <w:szCs w:val="20"/>
             <w:color w:val="292D32"/>
@@ -1966,7 +2215,7 @@
         <w:r>
           <w:rPr>
             <w:rStyle w:val="Hyperlink"/>
-            <w:rFonts w:eastAsia="Arial" w:cs="Arial"/>
+            <w:rFonts w:eastAsia="Palatino" w:cs="Palatino" w:ascii="Palatino" w:hAnsi="Palatino"/>
             <w:i/>
             <w:iCs/>
             <w:sz w:val="20"/>
@@ -1994,15 +2243,31 @@
       </w:pPr>
       <w:r>
         <w:rPr>
-          <w:rFonts w:ascii="Arial" w:hAnsi="Arial"/>
+          <w:rFonts w:ascii="Palatino" w:hAnsi="Palatino" w:eastAsia="Palatino" w:cs="Palatino"/>
           <w:b w:val="0"/>
           <w:sz w:val="20"/>
         </w:rPr>
-        <w:t xml:space="preserve">Roychowdhury, P.; Samanta, S.; Brown, L.; Waheed, S.; Powers, D. C. Bidirectional Electron Transfer Strategies for Anti-Markovnikov Olefin Aminofunctionalization via Arylamine Radicals. </w:t>
-      </w:r>
-      <w:r>
-        <w:rPr>
-          <w:rFonts w:ascii="Arial" w:hAnsi="Arial"/>
+        <w:t xml:space="preserve">Roychowdhury, P.; </w:t>
+      </w:r>
+      <w:r>
+        <w:rPr>
+          <w:rFonts w:ascii="Palatino" w:hAnsi="Palatino" w:eastAsia="Palatino" w:cs="Palatino"/>
+          <w:b w:val="1"/>
+          <w:sz w:val="20"/>
+        </w:rPr>
+        <w:t xml:space="preserve">Samanta, S.</w:t>
+      </w:r>
+      <w:r>
+        <w:rPr>
+          <w:rFonts w:ascii="Palatino" w:hAnsi="Palatino" w:eastAsia="Palatino" w:cs="Palatino"/>
+          <w:b w:val="0"/>
+          <w:sz w:val="20"/>
+        </w:rPr>
+        <w:t xml:space="preserve">; Brown, L.; Waheed, S.; Powers, D. C. Bidirectional Electron Transfer Strategies for Anti-Markovnikov Olefin Aminofunctionalization via Arylamine Radicals. </w:t>
+      </w:r>
+      <w:r>
+        <w:rPr>
+          <w:rFonts w:ascii="Palatino" w:hAnsi="Palatino" w:eastAsia="Palatino" w:cs="Palatino"/>
           <w:b w:val="0"/>
           <w:sz w:val="20"/>
           <w:i w:val="1"/>
@@ -2012,7 +2277,7 @@
       </w:r>
       <w:r>
         <w:rPr>
-          <w:rFonts w:ascii="Arial" w:hAnsi="Arial"/>
+          <w:rFonts w:ascii="Palatino" w:hAnsi="Palatino" w:eastAsia="Palatino" w:cs="Palatino"/>
           <w:b w:val="0"/>
           <w:sz w:val="20"/>
         </w:rPr>
@@ -2020,7 +2285,7 @@
       </w:r>
       <w:r>
         <w:rPr>
-          <w:rFonts w:ascii="Arial" w:hAnsi="Arial"/>
+          <w:rFonts w:ascii="Palatino" w:hAnsi="Palatino" w:eastAsia="Palatino" w:cs="Palatino"/>
           <w:b w:val="1"/>
           <w:sz w:val="20"/>
           <w:i w:val="0"/>
@@ -2030,7 +2295,7 @@
       </w:r>
       <w:r>
         <w:rPr>
-          <w:rFonts w:ascii="Arial" w:hAnsi="Arial"/>
+          <w:rFonts w:ascii="Palatino" w:hAnsi="Palatino" w:eastAsia="Palatino" w:cs="Palatino"/>
           <w:b w:val="0"/>
           <w:sz w:val="20"/>
         </w:rPr>
@@ -2038,7 +2303,7 @@
       </w:r>
       <w:r>
         <w:rPr>
-          <w:rFonts w:ascii="Arial" w:hAnsi="Arial"/>
+          <w:rFonts w:ascii="Palatino" w:hAnsi="Palatino" w:eastAsia="Palatino" w:cs="Palatino"/>
           <w:b w:val="0"/>
           <w:sz w:val="20"/>
           <w:i w:val="1"/>
@@ -2048,7 +2313,7 @@
       </w:r>
       <w:r>
         <w:rPr>
-          <w:rFonts w:ascii="Arial" w:hAnsi="Arial"/>
+          <w:rFonts w:ascii="Palatino" w:hAnsi="Palatino" w:eastAsia="Palatino" w:cs="Palatino"/>
           <w:b w:val="0"/>
           <w:sz w:val="20"/>
         </w:rPr>
@@ -2072,8 +2337,8 @@
       </w:pPr>
       <w:r>
         <w:rPr>
-          <w:rFonts w:eastAsia="Arial" w:cs="Arial"/>
-          <w:b/>
+          <w:rFonts w:eastAsia="Palatino" w:cs="Palatino" w:ascii="Palatino" w:hAnsi="Palatino"/>
+          <w:b w:val="1"/>
           <w:bCs/>
           <w:sz w:val="20"/>
           <w:szCs w:val="20"/>
@@ -2083,7 +2348,7 @@
       </w:r>
       <w:r>
         <w:rPr>
-          <w:rFonts w:eastAsia="Arial" w:cs="Arial"/>
+          <w:rFonts w:eastAsia="Palatino" w:cs="Palatino" w:ascii="Palatino" w:hAnsi="Palatino"/>
           <w:sz w:val="20"/>
           <w:szCs w:val="20"/>
           <w:color w:val="292D32"/>
@@ -2092,7 +2357,7 @@
       </w:r>
       <w:r>
         <w:rPr>
-          <w:rFonts w:eastAsia="Arial" w:cs="Arial"/>
+          <w:rFonts w:eastAsia="Palatino" w:cs="Palatino" w:ascii="Palatino" w:hAnsi="Palatino"/>
           <w:bCs/>
           <w:sz w:val="20"/>
           <w:szCs w:val="20"/>
@@ -2114,7 +2379,7 @@
       </w:r>
       <w:r>
         <w:rPr>
-          <w:rFonts w:eastAsia="Arial" w:cs="Arial"/>
+          <w:rFonts w:eastAsia="Palatino" w:cs="Palatino" w:ascii="Palatino" w:hAnsi="Palatino"/>
           <w:sz w:val="20"/>
           <w:szCs w:val="20"/>
           <w:color w:val="292D32"/>
@@ -2123,7 +2388,7 @@
       </w:r>
       <w:r>
         <w:rPr>
-          <w:rFonts w:eastAsia="Arial" w:cs="Arial"/>
+          <w:rFonts w:eastAsia="Palatino" w:cs="Palatino" w:ascii="Palatino" w:hAnsi="Palatino"/>
           <w:i w:val="1"/>
           <w:iCs/>
           <w:sz w:val="20"/>
@@ -2134,7 +2399,7 @@
       </w:r>
       <w:r>
         <w:rPr>
-          <w:rFonts w:eastAsia="Arial" w:cs="Arial"/>
+          <w:rFonts w:eastAsia="Palatino" w:cs="Palatino" w:ascii="Palatino" w:hAnsi="Palatino"/>
           <w:sz w:val="20"/>
           <w:szCs w:val="20"/>
           <w:color w:val="292D32"/>
@@ -2143,7 +2408,7 @@
       </w:r>
       <w:r>
         <w:rPr>
-          <w:rFonts w:eastAsia="Arial" w:cs="Arial"/>
+          <w:rFonts w:eastAsia="Palatino" w:cs="Palatino" w:ascii="Palatino" w:hAnsi="Palatino"/>
           <w:bCs/>
           <w:sz w:val="20"/>
           <w:szCs w:val="20"/>
@@ -2153,7 +2418,7 @@
       </w:r>
       <w:r>
         <w:rPr>
-          <w:rFonts w:eastAsia="Arial" w:cs="Arial"/>
+          <w:rFonts w:eastAsia="Palatino" w:cs="Palatino" w:ascii="Palatino" w:hAnsi="Palatino"/>
           <w:sz w:val="20"/>
           <w:szCs w:val="20"/>
           <w:color w:val="292D32"/>
@@ -2165,7 +2430,7 @@
         <w:r>
           <w:rPr>
             <w:rStyle w:val="Hyperlink"/>
-            <w:rFonts w:eastAsia="Arial" w:cs="Arial"/>
+            <w:rFonts w:eastAsia="Palatino" w:cs="Palatino" w:ascii="Palatino" w:hAnsi="Palatino"/>
             <w:i w:val="1"/>
             <w:iCs/>
             <w:sz w:val="20"/>
@@ -2179,7 +2444,7 @@
         <w:r>
           <w:rPr>
             <w:rStyle w:val="Hyperlink"/>
-            <w:rFonts w:eastAsia="Arial" w:cs="Arial"/>
+            <w:rFonts w:eastAsia="Palatino" w:cs="Palatino" w:ascii="Palatino" w:hAnsi="Palatino"/>
             <w:i w:val="1"/>
             <w:iCs/>
             <w:sz w:val="20"/>
@@ -2192,7 +2457,7 @@
         <w:r>
           <w:rPr>
             <w:rStyle w:val="Hyperlink"/>
-            <w:rFonts w:eastAsia="Arial" w:cs="Arial"/>
+            <w:rFonts w:eastAsia="Palatino" w:cs="Palatino" w:ascii="Palatino" w:hAnsi="Palatino"/>
             <w:i/>
             <w:iCs/>
             <w:sz w:val="20"/>
@@ -2204,7 +2469,7 @@
         <w:r>
           <w:rPr>
             <w:rStyle w:val="Hyperlink"/>
-            <w:rFonts w:eastAsia="Arial" w:cs="Arial"/>
+            <w:rFonts w:eastAsia="Palatino" w:cs="Palatino" w:ascii="Palatino" w:hAnsi="Palatino"/>
             <w:bCs/>
             <w:sz w:val="20"/>
             <w:szCs w:val="20"/>
@@ -2218,7 +2483,7 @@
         <w:r>
           <w:rPr>
             <w:rStyle w:val="Hyperlink"/>
-            <w:rFonts w:eastAsia="Arial" w:cs="Arial"/>
+            <w:rFonts w:eastAsia="Palatino" w:cs="Palatino" w:ascii="Palatino" w:hAnsi="Palatino"/>
             <w:i/>
             <w:iCs/>
             <w:sz w:val="20"/>
@@ -2230,7 +2495,7 @@
         <w:r>
           <w:rPr>
             <w:rStyle w:val="Hyperlink"/>
-            <w:rFonts w:eastAsia="Arial" w:cs="Arial"/>
+            <w:rFonts w:eastAsia="Palatino" w:cs="Palatino" w:ascii="Palatino" w:hAnsi="Palatino"/>
             <w:i w:val="1"/>
             <w:iCs/>
             <w:sz w:val="20"/>
@@ -2244,7 +2509,7 @@
         <w:r>
           <w:rPr>
             <w:rStyle w:val="Hyperlink"/>
-            <w:rFonts w:eastAsia="Arial" w:cs="Arial"/>
+            <w:rFonts w:eastAsia="Palatino" w:cs="Palatino" w:ascii="Palatino" w:hAnsi="Palatino"/>
             <w:sz w:val="20"/>
             <w:szCs w:val="20"/>
             <w:color w:val="292D32"/>
@@ -2254,7 +2519,7 @@
         <w:r>
           <w:rPr>
             <w:rStyle w:val="Hyperlink"/>
-            <w:rFonts w:eastAsia="Arial" w:cs="Arial"/>
+            <w:rFonts w:eastAsia="Palatino" w:cs="Palatino" w:ascii="Palatino" w:hAnsi="Palatino"/>
             <w:i/>
             <w:iCs/>
             <w:sz w:val="20"/>
@@ -2266,7 +2531,7 @@
         <w:r>
           <w:rPr>
             <w:rStyle w:val="Hyperlink"/>
-            <w:rFonts w:eastAsia="Arial" w:cs="Arial"/>
+            <w:rFonts w:eastAsia="Palatino" w:cs="Palatino" w:ascii="Palatino" w:hAnsi="Palatino"/>
             <w:sz w:val="20"/>
             <w:szCs w:val="20"/>
             <w:color w:val="292D32"/>
@@ -2276,7 +2541,7 @@
       </w:hyperlink>
       <w:r>
         <w:rPr>
-          <w:rFonts w:eastAsia="Arial" w:cs="Arial"/>
+          <w:rFonts w:eastAsia="Palatino" w:cs="Palatino" w:ascii="Palatino" w:hAnsi="Palatino"/>
           <w:sz w:val="20"/>
           <w:szCs w:val="20"/>
           <w:color w:val="292D32"/>
@@ -2285,7 +2550,7 @@
       </w:r>
       <w:r>
         <w:rPr>
-          <w:rFonts w:eastAsia="Arial" w:cs="Arial"/>
+          <w:rFonts w:eastAsia="Palatino" w:cs="Palatino" w:ascii="Palatino" w:hAnsi="Palatino"/>
           <w:bCs/>
           <w:sz w:val="20"/>
           <w:szCs w:val="20"/>
@@ -2295,7 +2560,7 @@
       </w:r>
       <w:r>
         <w:rPr>
-          <w:rFonts w:eastAsia="Arial" w:cs="Arial"/>
+          <w:rFonts w:eastAsia="Palatino" w:cs="Palatino" w:ascii="Palatino" w:hAnsi="Palatino"/>
           <w:sz w:val="20"/>
           <w:szCs w:val="20"/>
           <w:color w:val="292D32"/>
@@ -2304,7 +2569,7 @@
       </w:r>
       <w:r>
         <w:rPr>
-          <w:rFonts w:eastAsia="Arial" w:cs="Arial"/>
+          <w:rFonts w:eastAsia="Palatino" w:cs="Palatino" w:ascii="Palatino" w:hAnsi="Palatino"/>
           <w:bCs/>
           <w:i/>
           <w:iCs/>
@@ -2316,7 +2581,7 @@
       </w:r>
       <w:r>
         <w:rPr>
-          <w:rFonts w:eastAsia="Arial" w:cs="Arial"/>
+          <w:rFonts w:eastAsia="Palatino" w:cs="Palatino" w:ascii="Palatino" w:hAnsi="Palatino"/>
           <w:bCs/>
           <w:i w:val="0"/>
           <w:iCs/>
@@ -2330,7 +2595,7 @@
       </w:r>
       <w:r>
         <w:rPr>
-          <w:rFonts w:eastAsia="Arial" w:cs="Arial"/>
+          <w:rFonts w:eastAsia="Palatino" w:cs="Palatino" w:ascii="Palatino" w:hAnsi="Palatino"/>
           <w:bCs/>
           <w:i/>
           <w:iCs/>
@@ -2358,7 +2623,7 @@
       </w:pPr>
       <w:r>
         <w:rPr>
-          <w:rFonts w:eastAsia="Arial" w:cs="Arial"/>
+          <w:rFonts w:eastAsia="Palatino" w:cs="Palatino" w:ascii="Palatino" w:hAnsi="Palatino"/>
           <w:sz w:val="20"/>
           <w:szCs w:val="20"/>
           <w:color w:val="292D32"/>
@@ -2367,8 +2632,8 @@
       </w:r>
       <w:r>
         <w:rPr>
-          <w:rFonts w:eastAsia="Arial" w:cs="Arial"/>
-          <w:b/>
+          <w:rFonts w:eastAsia="Palatino" w:cs="Palatino" w:ascii="Palatino" w:hAnsi="Palatino"/>
+          <w:b w:val="1"/>
           <w:bCs/>
           <w:sz w:val="20"/>
           <w:szCs w:val="20"/>
@@ -2378,7 +2643,7 @@
       </w:r>
       <w:r>
         <w:rPr>
-          <w:rFonts w:eastAsia="Arial" w:cs="Arial"/>
+          <w:rFonts w:eastAsia="Palatino" w:cs="Palatino" w:ascii="Palatino" w:hAnsi="Palatino"/>
           <w:sz w:val="20"/>
           <w:szCs w:val="20"/>
           <w:color w:val="292D32"/>
@@ -2387,7 +2652,7 @@
       </w:r>
       <w:r>
         <w:rPr>
-          <w:rFonts w:eastAsia="Arial" w:cs="Arial"/>
+          <w:rFonts w:eastAsia="Palatino" w:cs="Palatino" w:ascii="Palatino" w:hAnsi="Palatino"/>
           <w:i w:val="1"/>
           <w:iCs/>
           <w:sz w:val="20"/>
@@ -2398,7 +2663,7 @@
       </w:r>
       <w:r>
         <w:rPr>
-          <w:rFonts w:eastAsia="Arial" w:cs="Arial"/>
+          <w:rFonts w:eastAsia="Palatino" w:cs="Palatino" w:ascii="Palatino" w:hAnsi="Palatino"/>
           <w:i/>
           <w:iCs/>
           <w:sz w:val="20"/>
@@ -2409,7 +2674,7 @@
       </w:r>
       <w:r>
         <w:rPr>
-          <w:rFonts w:eastAsia="Arial" w:cs="Arial"/>
+          <w:rFonts w:eastAsia="Palatino" w:cs="Palatino" w:ascii="Palatino" w:hAnsi="Palatino"/>
           <w:sz w:val="20"/>
           <w:szCs w:val="20"/>
           <w:color w:val="292D32"/>
@@ -2418,7 +2683,7 @@
       </w:r>
       <w:r>
         <w:rPr>
-          <w:rFonts w:eastAsia="Arial" w:cs="Arial"/>
+          <w:rFonts w:eastAsia="Palatino" w:cs="Palatino" w:ascii="Palatino" w:hAnsi="Palatino"/>
           <w:i w:val="1"/>
           <w:iCs/>
           <w:sz w:val="20"/>
@@ -2429,7 +2694,7 @@
       </w:r>
       <w:r>
         <w:rPr>
-          <w:rFonts w:eastAsia="Arial" w:cs="Arial"/>
+          <w:rFonts w:eastAsia="Palatino" w:cs="Palatino" w:ascii="Palatino" w:hAnsi="Palatino"/>
           <w:sz w:val="20"/>
           <w:szCs w:val="20"/>
           <w:color w:val="292D32"/>
@@ -2438,7 +2703,7 @@
       </w:r>
       <w:r>
         <w:rPr>
-          <w:rFonts w:eastAsia="Arial" w:cs="Arial"/>
+          <w:rFonts w:eastAsia="Palatino" w:cs="Palatino" w:ascii="Palatino" w:hAnsi="Palatino"/>
           <w:i/>
           <w:iCs/>
           <w:sz w:val="20"/>
@@ -2451,7 +2716,7 @@
         <w:r>
           <w:rPr>
             <w:rStyle w:val="Hyperlink"/>
-            <w:rFonts w:eastAsia="Arial" w:cs="Arial"/>
+            <w:rFonts w:eastAsia="Palatino" w:cs="Palatino" w:ascii="Palatino" w:hAnsi="Palatino"/>
             <w:i w:val="1"/>
             <w:iCs/>
             <w:sz w:val="20"/>
@@ -2464,7 +2729,7 @@
         <w:r>
           <w:rPr>
             <w:rStyle w:val="Hyperlink"/>
-            <w:rFonts w:eastAsia="Arial" w:cs="Arial"/>
+            <w:rFonts w:eastAsia="Palatino" w:cs="Palatino" w:ascii="Palatino" w:hAnsi="Palatino"/>
             <w:i/>
             <w:iCs/>
             <w:sz w:val="20"/>
@@ -2477,7 +2742,7 @@
         <w:r>
           <w:rPr>
             <w:rStyle w:val="Hyperlink"/>
-            <w:rFonts w:eastAsia="Arial" w:cs="Arial"/>
+            <w:rFonts w:eastAsia="Palatino" w:cs="Palatino" w:ascii="Palatino" w:hAnsi="Palatino"/>
             <w:bCs/>
             <w:sz w:val="20"/>
             <w:szCs w:val="20"/>
@@ -2492,7 +2757,7 @@
         <w:r>
           <w:rPr>
             <w:rStyle w:val="Hyperlink"/>
-            <w:rFonts w:eastAsia="Arial" w:cs="Arial"/>
+            <w:rFonts w:eastAsia="Palatino" w:cs="Palatino" w:ascii="Palatino" w:hAnsi="Palatino"/>
             <w:sz w:val="20"/>
             <w:szCs w:val="20"/>
             <w:lang w:val="de-DE"/>
@@ -2503,7 +2768,7 @@
         <w:r>
           <w:rPr>
             <w:rStyle w:val="Hyperlink"/>
-            <w:rFonts w:eastAsia="Arial" w:cs="Arial"/>
+            <w:rFonts w:eastAsia="Palatino" w:cs="Palatino" w:ascii="Palatino" w:hAnsi="Palatino"/>
             <w:i w:val="1"/>
             <w:iCs/>
             <w:sz w:val="20"/>
@@ -2518,7 +2783,7 @@
         <w:r>
           <w:rPr>
             <w:rStyle w:val="Hyperlink"/>
-            <w:rFonts w:eastAsia="Arial" w:cs="Arial"/>
+            <w:rFonts w:eastAsia="Palatino" w:cs="Palatino" w:ascii="Palatino" w:hAnsi="Palatino"/>
             <w:i/>
             <w:iCs/>
             <w:sz w:val="20"/>
@@ -2531,7 +2796,7 @@
         <w:r>
           <w:rPr>
             <w:rStyle w:val="Hyperlink"/>
-            <w:rFonts w:eastAsia="Arial" w:cs="Arial"/>
+            <w:rFonts w:eastAsia="Palatino" w:cs="Palatino" w:ascii="Palatino" w:hAnsi="Palatino"/>
             <w:sz w:val="20"/>
             <w:szCs w:val="20"/>
             <w:lang w:val="de-DE"/>
@@ -2542,7 +2807,7 @@
         <w:r>
           <w:rPr>
             <w:rStyle w:val="Hyperlink"/>
-            <w:rFonts w:eastAsia="Arial" w:cs="Arial"/>
+            <w:rFonts w:eastAsia="Palatino" w:cs="Palatino" w:ascii="Palatino" w:hAnsi="Palatino"/>
             <w:sz w:val="20"/>
             <w:szCs w:val="20"/>
             <w:color w:val="292D32"/>
@@ -2552,7 +2817,7 @@
       </w:hyperlink>
       <w:r>
         <w:rPr>
-          <w:rFonts w:eastAsia="Arial" w:cs="Arial"/>
+          <w:rFonts w:eastAsia="Palatino" w:cs="Palatino" w:ascii="Palatino" w:hAnsi="Palatino"/>
           <w:sz w:val="20"/>
           <w:szCs w:val="20"/>
           <w:color w:val="292D32"/>
@@ -2562,7 +2827,7 @@
       <w:proofErr w:type="spellStart"/>
       <w:r>
         <w:rPr>
-          <w:rFonts w:eastAsia="Arial" w:cs="Arial"/>
+          <w:rFonts w:eastAsia="Palatino" w:cs="Palatino" w:ascii="Palatino" w:hAnsi="Palatino"/>
           <w:i/>
           <w:iCs/>
           <w:sz w:val="20"/>
@@ -2574,7 +2839,7 @@
       <w:proofErr w:type="spellEnd"/>
       <w:r>
         <w:rPr>
-          <w:rFonts w:eastAsia="Arial" w:cs="Arial"/>
+          <w:rFonts w:eastAsia="Palatino" w:cs="Palatino" w:ascii="Palatino" w:hAnsi="Palatino"/>
           <w:sz w:val="20"/>
           <w:szCs w:val="20"/>
           <w:color w:val="292D32"/>
@@ -2583,7 +2848,7 @@
       </w:r>
       <w:r>
         <w:rPr>
-          <w:rFonts w:eastAsia="Arial" w:cs="Arial"/>
+          <w:rFonts w:eastAsia="Palatino" w:cs="Palatino" w:ascii="Palatino" w:hAnsi="Palatino"/>
           <w:bCs/>
           <w:sz w:val="20"/>
           <w:szCs w:val="20"/>
@@ -2596,7 +2861,7 @@
       </w:r>
       <w:r>
         <w:rPr>
-          <w:rFonts w:eastAsia="Arial" w:cs="Arial"/>
+          <w:rFonts w:eastAsia="Palatino" w:cs="Palatino" w:ascii="Palatino" w:hAnsi="Palatino"/>
           <w:sz w:val="20"/>
           <w:szCs w:val="20"/>
           <w:color w:val="292D32"/>
@@ -2617,7 +2882,7 @@
       </w:pPr>
       <w:r>
         <w:rPr>
-          <w:rFonts w:eastAsia="Arial" w:cs="Arial"/>
+          <w:rFonts w:eastAsia="Palatino" w:cs="Palatino" w:ascii="Palatino" w:hAnsi="Palatino"/>
           <w:sz w:val="20"/>
           <w:szCs w:val="20"/>
           <w:color w:val="292D32"/>
@@ -2628,7 +2893,7 @@
         <w:r>
           <w:rPr>
             <w:rStyle w:val="Hyperlink"/>
-            <w:rFonts w:eastAsia="Arial" w:cs="Arial"/>
+            <w:rFonts w:eastAsia="Palatino" w:cs="Palatino" w:ascii="Palatino" w:hAnsi="Palatino"/>
             <w:bCs/>
             <w:sz w:val="20"/>
             <w:szCs w:val="20"/>
@@ -2639,7 +2904,7 @@
         <w:r>
           <w:rPr>
             <w:rStyle w:val="Hyperlink"/>
-            <w:rFonts w:eastAsia="Arial" w:cs="Arial"/>
+            <w:rFonts w:eastAsia="Palatino" w:cs="Palatino" w:ascii="Palatino" w:hAnsi="Palatino"/>
             <w:bCs/>
             <w:sz w:val="20"/>
             <w:szCs w:val="20"/>
@@ -2650,7 +2915,7 @@
         <w:r>
           <w:rPr>
             <w:rStyle w:val="Hyperlink"/>
-            <w:rFonts w:eastAsia="Arial" w:cs="Arial"/>
+            <w:rFonts w:eastAsia="Palatino" w:cs="Palatino" w:ascii="Palatino" w:hAnsi="Palatino"/>
             <w:bCs/>
             <w:sz w:val="20"/>
             <w:szCs w:val="20"/>
@@ -2661,7 +2926,7 @@
       </w:hyperlink>
       <w:r>
         <w:rPr>
-          <w:rFonts w:eastAsia="Arial" w:cs="Arial"/>
+          <w:rFonts w:eastAsia="Palatino" w:cs="Palatino" w:ascii="Palatino" w:hAnsi="Palatino"/>
           <w:sz w:val="20"/>
           <w:szCs w:val="20"/>
           <w:color w:val="292D32"/>
@@ -2686,7 +2951,7 @@
       </w:pPr>
       <w:r>
         <w:rPr>
-          <w:rFonts w:eastAsia="Arial" w:cs="Arial"/>
+          <w:rFonts w:eastAsia="Arial" w:cs="Arial" w:ascii="Arial" w:hAnsi="Arial"/>
           <w:color w:val="253D50"/>
           <w:sz w:val="21"/>
           <w:b/>
@@ -2696,7 +2961,7 @@
       </w:r>
       <w:r>
         <w:rPr>
-          <w:rFonts w:eastAsia="Arial" w:cs="Arial"/>
+          <w:rFonts w:eastAsia="Arial" w:cs="Arial" w:ascii="Arial" w:hAnsi="Arial"/>
           <w:color w:val="253D50"/>
           <w:sz w:val="21"/>
           <w:b/>
@@ -2706,7 +2971,7 @@
       </w:r>
       <w:r>
         <w:rPr>
-          <w:rFonts w:eastAsia="Arial" w:cs="Arial"/>
+          <w:rFonts w:eastAsia="Arial" w:cs="Arial" w:ascii="Arial" w:hAnsi="Arial"/>
           <w:color w:val="253D50"/>
           <w:sz w:val="21"/>
           <w:b/>
@@ -2716,7 +2981,7 @@
       </w:r>
       <w:r>
         <w:rPr>
-          <w:rFonts w:eastAsia="Arial" w:cs="Arial"/>
+          <w:rFonts w:eastAsia="Arial" w:cs="Arial" w:ascii="Arial" w:hAnsi="Arial"/>
           <w:color w:val="253D50"/>
           <w:sz w:val="21"/>
           <w:b/>
@@ -2742,7 +3007,7 @@
       </w:pPr>
       <w:r>
         <w:rPr>
-          <w:rFonts w:eastAsia="Arial" w:cs="Arial"/>
+          <w:rFonts w:eastAsia="Palatino" w:cs="Palatino" w:ascii="Palatino" w:hAnsi="Palatino"/>
           <w:bCs/>
           <w:sz w:val="20"/>
           <w:szCs w:val="20"/>
@@ -2752,7 +3017,7 @@
       </w:r>
       <w:r>
         <w:rPr>
-          <w:rFonts w:eastAsia="Arial" w:cs="Arial"/>
+          <w:rFonts w:eastAsia="Palatino" w:cs="Palatino" w:ascii="Palatino" w:hAnsi="Palatino"/>
           <w:sz w:val="20"/>
           <w:szCs w:val="20"/>
           <w:color w:val="292D32"/>
@@ -2761,7 +3026,7 @@
       </w:r>
       <w:r>
         <w:rPr>
-          <w:rFonts w:eastAsia="Arial" w:cs="Arial"/>
+          <w:rFonts w:eastAsia="Palatino" w:cs="Palatino" w:ascii="Palatino" w:hAnsi="Palatino"/>
           <w:i/>
           <w:iCs/>
           <w:sz w:val="20"/>
@@ -2772,7 +3037,7 @@
       </w:r>
       <w:r>
         <w:rPr>
-          <w:rFonts w:eastAsia="Arial" w:cs="Arial"/>
+          <w:rFonts w:eastAsia="Palatino" w:cs="Palatino" w:ascii="Palatino" w:hAnsi="Palatino"/>
           <w:sz w:val="20"/>
           <w:szCs w:val="20"/>
           <w:color w:val="292D32"/>
@@ -2784,12 +3049,13 @@
           <w:color w:val="292D32"/>
           <w:sz w:val="20"/>
           <w:szCs w:val="20"/>
+          <w:rFonts w:ascii="Palatino" w:hAnsi="Palatino" w:eastAsia="Palatino" w:cs="Palatino"/>
         </w:rPr>
         <w:t xml:space="preserve">at </w:t>
       </w:r>
       <w:r>
         <w:rPr>
-          <w:rFonts w:eastAsia="Arial" w:cs="Arial"/>
+          <w:rFonts w:eastAsia="Palatino" w:cs="Palatino" w:ascii="Palatino" w:hAnsi="Palatino"/>
           <w:bCs/>
           <w:sz w:val="20"/>
           <w:szCs w:val="20"/>
@@ -2799,7 +3065,7 @@
       </w:r>
       <w:r>
         <w:rPr>
-          <w:rFonts w:eastAsia="Arial" w:cs="Arial"/>
+          <w:rFonts w:eastAsia="Palatino" w:cs="Palatino" w:ascii="Palatino" w:hAnsi="Palatino"/>
           <w:color w:val="606A74"/>
           <w:sz w:val="20"/>
           <w:szCs w:val="20"/>
@@ -2810,7 +3076,7 @@
       </w:r>
       <w:r>
         <w:rPr>
-          <w:rFonts w:eastAsia="Arial" w:cs="Arial"/>
+          <w:rFonts w:eastAsia="Palatino" w:cs="Palatino" w:ascii="Palatino" w:hAnsi="Palatino"/>
           <w:b w:val="0"/>
           <w:bCs/>
           <w:i w:val="0"/>
@@ -2839,7 +3105,7 @@
       </w:pPr>
       <w:r>
         <w:rPr>
-          <w:rFonts w:eastAsia="Arial" w:cs="Arial"/>
+          <w:rFonts w:eastAsia="Palatino" w:cs="Palatino" w:ascii="Palatino" w:hAnsi="Palatino"/>
           <w:bCs/>
           <w:sz w:val="20"/>
           <w:szCs w:val="20"/>
@@ -2849,7 +3115,7 @@
       </w:r>
       <w:r>
         <w:rPr>
-          <w:rFonts w:eastAsia="Arial" w:cs="Arial"/>
+          <w:rFonts w:eastAsia="Palatino" w:cs="Palatino" w:ascii="Palatino" w:hAnsi="Palatino"/>
           <w:sz w:val="20"/>
           <w:szCs w:val="20"/>
           <w:color w:val="292D32"/>
@@ -2869,7 +3135,7 @@
       </w:r>
       <w:r>
         <w:rPr>
-          <w:rFonts w:eastAsia="Arial" w:cs="Arial"/>
+          <w:rFonts w:eastAsia="Palatino" w:cs="Palatino" w:ascii="Palatino" w:hAnsi="Palatino"/>
           <w:i/>
           <w:iCs/>
           <w:sz w:val="20"/>
@@ -2880,7 +3146,7 @@
       </w:r>
       <w:r>
         <w:rPr>
-          <w:rFonts w:eastAsia="Arial" w:cs="Arial"/>
+          <w:rFonts w:eastAsia="Palatino" w:cs="Palatino" w:ascii="Palatino" w:hAnsi="Palatino"/>
           <w:i w:val="1"/>
           <w:iCs/>
           <w:sz w:val="20"/>
@@ -2891,7 +3157,7 @@
       </w:r>
       <w:r>
         <w:rPr>
-          <w:rFonts w:eastAsia="Arial" w:cs="Arial"/>
+          <w:rFonts w:eastAsia="Palatino" w:cs="Palatino" w:ascii="Palatino" w:hAnsi="Palatino"/>
           <w:i/>
           <w:iCs/>
           <w:sz w:val="20"/>
@@ -2902,7 +3168,7 @@
       </w:r>
       <w:r>
         <w:rPr>
-          <w:rFonts w:eastAsia="Arial" w:cs="Arial"/>
+          <w:rFonts w:eastAsia="Palatino" w:cs="Palatino" w:ascii="Palatino" w:hAnsi="Palatino"/>
           <w:bCs/>
           <w:i/>
           <w:iCs/>
@@ -2914,7 +3180,7 @@
       </w:r>
       <w:r>
         <w:rPr>
-          <w:rFonts w:eastAsia="Arial" w:cs="Arial"/>
+          <w:rFonts w:eastAsia="Palatino" w:cs="Palatino" w:ascii="Palatino" w:hAnsi="Palatino"/>
           <w:i/>
           <w:iCs/>
           <w:sz w:val="20"/>
@@ -2925,7 +3191,7 @@
       </w:r>
       <w:r>
         <w:rPr>
-          <w:rFonts w:eastAsia="Arial" w:cs="Arial"/>
+          <w:rFonts w:eastAsia="Palatino" w:cs="Palatino" w:ascii="Palatino" w:hAnsi="Palatino"/>
           <w:sz w:val="20"/>
           <w:szCs w:val="20"/>
           <w:color w:val="292D32"/>
@@ -2950,7 +3216,7 @@
       </w:pPr>
       <w:r>
         <w:rPr>
-          <w:rFonts w:eastAsia="Arial" w:cs="Arial"/>
+          <w:rFonts w:eastAsia="Palatino" w:cs="Palatino" w:ascii="Palatino" w:hAnsi="Palatino"/>
           <w:bCs/>
           <w:sz w:val="20"/>
           <w:szCs w:val="20"/>
@@ -2960,7 +3226,7 @@
       </w:r>
       <w:r>
         <w:rPr>
-          <w:rFonts w:eastAsia="Arial" w:cs="Arial"/>
+          <w:rFonts w:eastAsia="Palatino" w:cs="Palatino" w:ascii="Palatino" w:hAnsi="Palatino"/>
           <w:sz w:val="20"/>
           <w:szCs w:val="20"/>
           <w:color w:val="292D32"/>
@@ -2969,7 +3235,7 @@
       </w:r>
       <w:r>
         <w:rPr>
-          <w:rFonts w:eastAsia="Arial" w:cs="Arial"/>
+          <w:rFonts w:eastAsia="Palatino" w:cs="Palatino" w:ascii="Palatino" w:hAnsi="Palatino"/>
           <w:color w:val="606A74"/>
           <w:sz w:val="20"/>
           <w:szCs w:val="20"/>
@@ -2980,7 +3246,7 @@
       </w:r>
       <w:r>
         <w:rPr>
-          <w:rFonts w:eastAsia="Arial" w:cs="Arial"/>
+          <w:rFonts w:eastAsia="Palatino" w:cs="Palatino" w:ascii="Palatino" w:hAnsi="Palatino"/>
           <w:b w:val="0"/>
           <w:bCs/>
           <w:i w:val="0"/>
@@ -3009,7 +3275,7 @@
       </w:pPr>
       <w:r>
         <w:rPr>
-          <w:rFonts w:eastAsia="Arial" w:cs="Arial"/>
+          <w:rFonts w:eastAsia="Palatino" w:cs="Palatino" w:ascii="Palatino" w:hAnsi="Palatino"/>
           <w:bCs/>
           <w:sz w:val="20"/>
           <w:szCs w:val="20"/>
@@ -3019,7 +3285,7 @@
       </w:r>
       <w:r>
         <w:rPr>
-          <w:rFonts w:eastAsia="Arial" w:cs="Arial"/>
+          <w:rFonts w:eastAsia="Palatino" w:cs="Palatino" w:ascii="Palatino" w:hAnsi="Palatino"/>
           <w:sz w:val="20"/>
           <w:szCs w:val="20"/>
           <w:color w:val="292D32"/>
@@ -3028,7 +3294,7 @@
       </w:r>
       <w:r>
         <w:rPr>
-          <w:rFonts w:eastAsia="Arial" w:cs="Arial"/>
+          <w:rFonts w:eastAsia="Palatino" w:cs="Palatino" w:ascii="Palatino" w:hAnsi="Palatino"/>
           <w:color w:val="606A74"/>
           <w:sz w:val="20"/>
           <w:szCs w:val="20"/>
@@ -3039,7 +3305,7 @@
       </w:r>
       <w:r>
         <w:rPr>
-          <w:rFonts w:eastAsia="Arial" w:cs="Arial"/>
+          <w:rFonts w:eastAsia="Palatino" w:cs="Palatino" w:ascii="Palatino" w:hAnsi="Palatino"/>
           <w:b w:val="0"/>
           <w:bCs/>
           <w:i w:val="0"/>
@@ -3068,7 +3334,7 @@
       </w:pPr>
       <w:r>
         <w:rPr>
-          <w:rFonts w:eastAsia="Arial" w:cs="Arial"/>
+          <w:rFonts w:eastAsia="Palatino" w:cs="Palatino" w:ascii="Palatino" w:hAnsi="Palatino"/>
           <w:bCs/>
           <w:sz w:val="20"/>
           <w:szCs w:val="20"/>
@@ -3078,7 +3344,7 @@
       </w:r>
       <w:r>
         <w:rPr>
-          <w:rFonts w:eastAsia="Arial" w:cs="Arial"/>
+          <w:rFonts w:eastAsia="Palatino" w:cs="Palatino" w:ascii="Palatino" w:hAnsi="Palatino"/>
           <w:sz w:val="20"/>
           <w:szCs w:val="20"/>
           <w:color w:val="292D32"/>
@@ -3087,7 +3353,7 @@
       </w:r>
       <w:r>
         <w:rPr>
-          <w:rFonts w:eastAsia="Arial" w:cs="Arial"/>
+          <w:rFonts w:eastAsia="Palatino" w:cs="Palatino" w:ascii="Palatino" w:hAnsi="Palatino"/>
           <w:i/>
           <w:iCs/>
           <w:sz w:val="20"/>
@@ -3098,7 +3364,7 @@
       </w:r>
       <w:r>
         <w:rPr>
-          <w:rFonts w:eastAsia="Arial" w:cs="Arial"/>
+          <w:rFonts w:eastAsia="Palatino" w:cs="Palatino" w:ascii="Palatino" w:hAnsi="Palatino"/>
           <w:i w:val="1"/>
           <w:iCs/>
           <w:sz w:val="20"/>
@@ -3109,7 +3375,7 @@
       </w:r>
       <w:r>
         <w:rPr>
-          <w:rFonts w:eastAsia="Arial" w:cs="Arial"/>
+          <w:rFonts w:eastAsia="Palatino" w:cs="Palatino" w:ascii="Palatino" w:hAnsi="Palatino"/>
           <w:i/>
           <w:iCs/>
           <w:sz w:val="20"/>
@@ -3120,7 +3386,7 @@
       </w:r>
       <w:r>
         <w:rPr>
-          <w:rFonts w:eastAsia="Arial" w:cs="Arial"/>
+          <w:rFonts w:eastAsia="Palatino" w:cs="Palatino" w:ascii="Palatino" w:hAnsi="Palatino"/>
           <w:sz w:val="20"/>
           <w:szCs w:val="20"/>
           <w:color w:val="292D32"/>
@@ -3129,7 +3395,7 @@
       </w:r>
       <w:r>
         <w:rPr>
-          <w:rFonts w:eastAsia="Arial" w:cs="Arial"/>
+          <w:rFonts w:eastAsia="Palatino" w:cs="Palatino" w:ascii="Palatino" w:hAnsi="Palatino"/>
           <w:sz w:val="20"/>
           <w:szCs w:val="20"/>
           <w:color w:val="292D32"/>
@@ -3154,7 +3420,7 @@
       </w:pPr>
       <w:r>
         <w:rPr>
-          <w:rFonts w:eastAsia="Arial" w:cs="Arial"/>
+          <w:rFonts w:eastAsia="Palatino" w:cs="Palatino" w:ascii="Palatino" w:hAnsi="Palatino"/>
           <w:bCs/>
           <w:kern w:val="36"/>
           <w:sz w:val="20"/>
@@ -3166,7 +3432,7 @@
       <w:proofErr w:type="spellStart"/>
       <w:r>
         <w:rPr>
-          <w:rFonts w:eastAsia="Arial" w:cs="Arial"/>
+          <w:rFonts w:eastAsia="Palatino" w:cs="Palatino" w:ascii="Palatino" w:hAnsi="Palatino"/>
           <w:bCs/>
           <w:kern w:val="36"/>
           <w:sz w:val="20"/>
@@ -3178,7 +3444,7 @@
       <w:proofErr w:type="spellEnd"/>
       <w:r>
         <w:rPr>
-          <w:rFonts w:eastAsia="Arial" w:cs="Arial"/>
+          <w:rFonts w:eastAsia="Palatino" w:cs="Palatino" w:ascii="Palatino" w:hAnsi="Palatino"/>
           <w:bCs/>
           <w:kern w:val="36"/>
           <w:sz w:val="20"/>
@@ -3189,7 +3455,7 @@
       </w:r>
       <w:r>
         <w:rPr>
-          <w:rFonts w:eastAsia="Arial" w:cs="Arial"/>
+          <w:rFonts w:eastAsia="Palatino" w:cs="Palatino" w:ascii="Palatino" w:hAnsi="Palatino"/>
           <w:kern w:val="36"/>
           <w:sz w:val="20"/>
           <w:szCs w:val="20"/>
@@ -3199,7 +3465,7 @@
       </w:r>
       <w:r>
         <w:rPr>
-          <w:rFonts w:eastAsia="Arial" w:cs="Arial"/>
+          <w:rFonts w:eastAsia="Palatino" w:cs="Palatino" w:ascii="Palatino" w:hAnsi="Palatino"/>
           <w:color w:val="606A74"/>
           <w:kern w:val="36"/>
           <w:sz w:val="20"/>
@@ -3211,7 +3477,7 @@
       </w:r>
       <w:r>
         <w:rPr>
-          <w:rFonts w:eastAsia="Arial" w:cs="Arial"/>
+          <w:rFonts w:eastAsia="Palatino" w:cs="Palatino" w:ascii="Palatino" w:hAnsi="Palatino"/>
           <w:b w:val="0"/>
           <w:bCs/>
           <w:i w:val="0"/>
@@ -3241,7 +3507,7 @@
       </w:pPr>
       <w:r>
         <w:rPr>
-          <w:rFonts w:eastAsia="Arial" w:cs="Arial"/>
+          <w:rFonts w:eastAsia="Palatino" w:cs="Palatino" w:ascii="Palatino" w:hAnsi="Palatino"/>
           <w:bCs/>
           <w:sz w:val="20"/>
           <w:szCs w:val="20"/>
@@ -3251,7 +3517,7 @@
       </w:r>
       <w:r>
         <w:rPr>
-          <w:rFonts w:eastAsia="Arial" w:cs="Arial"/>
+          <w:rFonts w:eastAsia="Palatino" w:cs="Palatino" w:ascii="Palatino" w:hAnsi="Palatino"/>
           <w:sz w:val="20"/>
           <w:szCs w:val="20"/>
           <w:color w:val="292D32"/>
@@ -3260,7 +3526,7 @@
       </w:r>
       <w:r>
         <w:rPr>
-          <w:rFonts w:eastAsia="Arial" w:cs="Arial"/>
+          <w:rFonts w:eastAsia="Palatino" w:cs="Palatino" w:ascii="Palatino" w:hAnsi="Palatino"/>
           <w:color w:val="606A74"/>
           <w:sz w:val="20"/>
           <w:szCs w:val="20"/>
@@ -3271,7 +3537,7 @@
       </w:r>
       <w:r>
         <w:rPr>
-          <w:rFonts w:eastAsia="Arial" w:cs="Arial"/>
+          <w:rFonts w:eastAsia="Palatino" w:cs="Palatino" w:ascii="Palatino" w:hAnsi="Palatino"/>
           <w:b w:val="0"/>
           <w:bCs/>
           <w:i w:val="0"/>
@@ -3300,7 +3566,7 @@
       </w:pPr>
       <w:r>
         <w:rPr>
-          <w:rFonts w:eastAsia="Arial" w:cs="Arial"/>
+          <w:rFonts w:eastAsia="Palatino" w:cs="Palatino" w:ascii="Palatino" w:hAnsi="Palatino"/>
           <w:bCs/>
           <w:sz w:val="20"/>
           <w:szCs w:val="20"/>
@@ -3310,7 +3576,7 @@
       </w:r>
       <w:r>
         <w:rPr>
-          <w:rFonts w:eastAsia="Arial" w:cs="Arial"/>
+          <w:rFonts w:eastAsia="Palatino" w:cs="Palatino" w:ascii="Palatino" w:hAnsi="Palatino"/>
           <w:sz w:val="20"/>
           <w:szCs w:val="20"/>
           <w:color w:val="292D32"/>
@@ -3319,7 +3585,7 @@
       </w:r>
       <w:r>
         <w:rPr>
-          <w:rFonts w:eastAsia="Arial" w:cs="Arial"/>
+          <w:rFonts w:eastAsia="Palatino" w:cs="Palatino" w:ascii="Palatino" w:hAnsi="Palatino"/>
           <w:color w:val="606A74"/>
           <w:sz w:val="20"/>
           <w:szCs w:val="20"/>
@@ -3330,7 +3596,7 @@
       </w:r>
       <w:r>
         <w:rPr>
-          <w:rFonts w:eastAsia="Arial" w:cs="Arial"/>
+          <w:rFonts w:eastAsia="Palatino" w:cs="Palatino" w:ascii="Palatino" w:hAnsi="Palatino"/>
           <w:b w:val="0"/>
           <w:bCs/>
           <w:i w:val="0"/>
@@ -3359,7 +3625,7 @@
       </w:pPr>
       <w:r>
         <w:rPr>
-          <w:rFonts w:eastAsia="Arial" w:cs="Arial"/>
+          <w:rFonts w:eastAsia="Arial" w:cs="Arial" w:ascii="Arial" w:hAnsi="Arial"/>
           <w:color w:val="253D50"/>
           <w:sz w:val="21"/>
           <w:b/>
@@ -3385,7 +3651,7 @@
       </w:pPr>
       <w:r>
         <w:rPr>
-          <w:rFonts w:eastAsia="Arial" w:cs="Arial"/>
+          <w:rFonts w:eastAsia="Palatino" w:cs="Palatino" w:ascii="Palatino" w:hAnsi="Palatino"/>
           <w:bCs/>
           <w:sz w:val="20"/>
           <w:szCs w:val="20"/>
@@ -3395,7 +3661,7 @@
       </w:r>
       <w:r>
         <w:rPr>
-          <w:rFonts w:eastAsia="Arial" w:cs="Arial"/>
+          <w:rFonts w:eastAsia="Palatino" w:cs="Palatino" w:ascii="Palatino" w:hAnsi="Palatino"/>
           <w:sz w:val="20"/>
           <w:szCs w:val="20"/>
           <w:color w:val="292D32"/>
@@ -3404,7 +3670,7 @@
       </w:r>
       <w:r>
         <w:rPr>
-          <w:rFonts w:eastAsia="Arial" w:cs="Arial"/>
+          <w:rFonts w:eastAsia="Palatino" w:cs="Palatino" w:ascii="Palatino" w:hAnsi="Palatino"/>
           <w:i w:val="1"/>
           <w:iCs/>
           <w:sz w:val="20"/>
@@ -3415,7 +3681,7 @@
       </w:r>
       <w:r>
         <w:rPr>
-          <w:rFonts w:eastAsia="Arial" w:cs="Arial"/>
+          <w:rFonts w:eastAsia="Palatino" w:cs="Palatino" w:ascii="Palatino" w:hAnsi="Palatino"/>
           <w:i/>
           <w:iCs/>
           <w:sz w:val="20"/>
@@ -3426,7 +3692,7 @@
       </w:r>
       <w:r>
         <w:rPr>
-          <w:rFonts w:eastAsia="Arial" w:cs="Arial"/>
+          <w:rFonts w:eastAsia="Palatino" w:cs="Palatino" w:ascii="Palatino" w:hAnsi="Palatino"/>
           <w:sz w:val="20"/>
           <w:szCs w:val="20"/>
           <w:color w:val="292D32"/>
@@ -3435,7 +3701,7 @@
       </w:r>
       <w:r>
         <w:rPr>
-          <w:rFonts w:eastAsia="Arial" w:cs="Arial"/>
+          <w:rFonts w:eastAsia="Palatino" w:cs="Palatino" w:ascii="Palatino" w:hAnsi="Palatino"/>
           <w:bCs/>
           <w:sz w:val="20"/>
           <w:szCs w:val="20"/>
@@ -3445,7 +3711,7 @@
       </w:r>
       <w:r>
         <w:rPr>
-          <w:rFonts w:eastAsia="Arial" w:cs="Arial"/>
+          <w:rFonts w:eastAsia="Palatino" w:cs="Palatino" w:ascii="Palatino" w:hAnsi="Palatino"/>
           <w:b w:val="0"/>
           <w:bCs/>
           <w:color w:val="606A74"/>
@@ -3457,7 +3723,7 @@
       </w:r>
       <w:r>
         <w:rPr>
-          <w:rFonts w:eastAsia="Arial" w:cs="Arial"/>
+          <w:rFonts w:eastAsia="Palatino" w:cs="Palatino" w:ascii="Palatino" w:hAnsi="Palatino"/>
           <w:b w:val="0"/>
           <w:bCs/>
           <w:i w:val="0"/>
@@ -3486,7 +3752,7 @@
       </w:pPr>
       <w:r>
         <w:rPr>
-          <w:rFonts w:eastAsia="Arial" w:cs="Arial"/>
+          <w:rFonts w:eastAsia="Palatino" w:cs="Palatino" w:ascii="Palatino" w:hAnsi="Palatino"/>
           <w:bCs/>
           <w:sz w:val="20"/>
           <w:szCs w:val="20"/>
@@ -3496,7 +3762,7 @@
       </w:r>
       <w:r>
         <w:rPr>
-          <w:rFonts w:eastAsia="Arial" w:cs="Arial"/>
+          <w:rFonts w:eastAsia="Palatino" w:cs="Palatino" w:ascii="Palatino" w:hAnsi="Palatino"/>
           <w:sz w:val="20"/>
           <w:szCs w:val="20"/>
           <w:color w:val="292D32"/>
@@ -3516,7 +3782,7 @@
       </w:r>
       <w:r>
         <w:rPr>
-          <w:rFonts w:eastAsia="Arial" w:cs="Arial"/>
+          <w:rFonts w:eastAsia="Palatino" w:cs="Palatino" w:ascii="Palatino" w:hAnsi="Palatino"/>
           <w:i/>
           <w:iCs/>
           <w:sz w:val="20"/>
@@ -3527,7 +3793,7 @@
       </w:r>
       <w:r>
         <w:rPr>
-          <w:rFonts w:eastAsia="Arial" w:cs="Arial"/>
+          <w:rFonts w:eastAsia="Palatino" w:cs="Palatino" w:ascii="Palatino" w:hAnsi="Palatino"/>
           <w:i w:val="1"/>
           <w:iCs/>
           <w:sz w:val="20"/>
@@ -3538,7 +3804,7 @@
       </w:r>
       <w:r>
         <w:rPr>
-          <w:rFonts w:eastAsia="Arial" w:cs="Arial"/>
+          <w:rFonts w:eastAsia="Palatino" w:cs="Palatino" w:ascii="Palatino" w:hAnsi="Palatino"/>
           <w:i/>
           <w:iCs/>
           <w:sz w:val="20"/>
@@ -3549,7 +3815,7 @@
       </w:r>
       <w:r>
         <w:rPr>
-          <w:rFonts w:eastAsia="Arial" w:cs="Arial"/>
+          <w:rFonts w:eastAsia="Palatino" w:cs="Palatino" w:ascii="Palatino" w:hAnsi="Palatino"/>
           <w:bCs/>
           <w:i/>
           <w:iCs/>
@@ -3561,7 +3827,7 @@
       </w:r>
       <w:r>
         <w:rPr>
-          <w:rFonts w:eastAsia="Arial" w:cs="Arial"/>
+          <w:rFonts w:eastAsia="Palatino" w:cs="Palatino" w:ascii="Palatino" w:hAnsi="Palatino"/>
           <w:i/>
           <w:iCs/>
           <w:sz w:val="20"/>
@@ -3572,7 +3838,7 @@
       </w:r>
       <w:r>
         <w:rPr>
-          <w:rFonts w:eastAsia="Arial" w:cs="Arial"/>
+          <w:rFonts w:eastAsia="Palatino" w:cs="Palatino" w:ascii="Palatino" w:hAnsi="Palatino"/>
           <w:sz w:val="20"/>
           <w:szCs w:val="20"/>
           <w:color w:val="292D32"/>
@@ -3581,7 +3847,7 @@
       </w:r>
       <w:r>
         <w:rPr>
-          <w:rFonts w:eastAsia="Arial" w:cs="Arial"/>
+          <w:rFonts w:eastAsia="Palatino" w:cs="Palatino" w:ascii="Palatino" w:hAnsi="Palatino"/>
           <w:bCs/>
           <w:sz w:val="20"/>
           <w:szCs w:val="20"/>
@@ -3591,7 +3857,7 @@
       </w:r>
       <w:r>
         <w:rPr>
-          <w:rFonts w:eastAsia="Arial" w:cs="Arial"/>
+          <w:rFonts w:eastAsia="Palatino" w:cs="Palatino" w:ascii="Palatino" w:hAnsi="Palatino"/>
           <w:b w:val="0"/>
           <w:bCs/>
           <w:color w:val="606A74"/>
@@ -3603,7 +3869,7 @@
       </w:r>
       <w:r>
         <w:rPr>
-          <w:rFonts w:eastAsia="Arial" w:cs="Arial"/>
+          <w:rFonts w:eastAsia="Palatino" w:cs="Palatino" w:ascii="Palatino" w:hAnsi="Palatino"/>
           <w:b w:val="0"/>
           <w:bCs/>
           <w:i w:val="0"/>
@@ -3632,7 +3898,7 @@
       </w:pPr>
       <w:r>
         <w:rPr>
-          <w:rFonts w:eastAsia="Arial" w:cs="Arial"/>
+          <w:rFonts w:eastAsia="Arial" w:cs="Arial" w:ascii="Arial" w:hAnsi="Arial"/>
           <w:color w:val="253D50"/>
           <w:sz w:val="21"/>
           <w:b/>
@@ -3642,7 +3908,7 @@
       </w:r>
       <w:r>
         <w:rPr>
-          <w:rFonts w:eastAsia="Arial" w:cs="Arial"/>
+          <w:rFonts w:eastAsia="Arial" w:cs="Arial" w:ascii="Arial" w:hAnsi="Arial"/>
           <w:color w:val="253D50"/>
           <w:sz w:val="21"/>
           <w:b/>
@@ -3652,7 +3918,7 @@
       </w:r>
       <w:r>
         <w:rPr>
-          <w:rFonts w:eastAsia="Arial" w:cs="Arial"/>
+          <w:rFonts w:eastAsia="Arial" w:cs="Arial" w:ascii="Arial" w:hAnsi="Arial"/>
           <w:color w:val="253D50"/>
           <w:sz w:val="21"/>
           <w:b/>
@@ -3679,7 +3945,7 @@
       </w:pPr>
       <w:r>
         <w:rPr>
-          <w:rFonts w:eastAsia="Arial" w:cs="Arial"/>
+          <w:rFonts w:eastAsia="Palatino" w:cs="Palatino" w:ascii="Palatino" w:hAnsi="Palatino"/>
           <w:sz w:val="20"/>
           <w:szCs w:val="20"/>
           <w:color w:val="292D32"/>
@@ -3688,7 +3954,7 @@
       </w:r>
       <w:r>
         <w:rPr>
-          <w:rFonts w:eastAsia="Arial" w:cs="Arial"/>
+          <w:rFonts w:eastAsia="Palatino" w:cs="Palatino" w:ascii="Palatino" w:hAnsi="Palatino"/>
           <w:sz w:val="20"/>
           <w:szCs w:val="20"/>
           <w:color w:val="292D32"/>
@@ -3697,7 +3963,7 @@
       </w:r>
       <w:r>
         <w:rPr>
-          <w:rFonts w:eastAsia="Arial" w:cs="Arial"/>
+          <w:rFonts w:eastAsia="Palatino" w:cs="Palatino" w:ascii="Palatino" w:hAnsi="Palatino"/>
           <w:bCs/>
           <w:sz w:val="20"/>
           <w:szCs w:val="20"/>
@@ -3707,7 +3973,7 @@
       </w:r>
       <w:r>
         <w:rPr>
-          <w:rFonts w:eastAsia="Arial" w:cs="Arial"/>
+          <w:rFonts w:eastAsia="Palatino" w:cs="Palatino" w:ascii="Palatino" w:hAnsi="Palatino"/>
           <w:bCs/>
           <w:sz w:val="20"/>
           <w:szCs w:val="20"/>
@@ -3718,7 +3984,7 @@
       </w:r>
       <w:r>
         <w:rPr>
-          <w:rFonts w:eastAsia="Arial" w:cs="Arial"/>
+          <w:rFonts w:eastAsia="Palatino" w:cs="Palatino" w:ascii="Palatino" w:hAnsi="Palatino"/>
           <w:bCs/>
           <w:sz w:val="20"/>
           <w:szCs w:val="20"/>
@@ -3728,7 +3994,7 @@
       </w:r>
       <w:r>
         <w:rPr>
-          <w:rFonts w:eastAsia="Arial" w:cs="Arial"/>
+          <w:rFonts w:eastAsia="Palatino" w:cs="Palatino" w:ascii="Palatino" w:hAnsi="Palatino"/>
           <w:sz w:val="20"/>
           <w:szCs w:val="20"/>
           <w:color w:val="292D32"/>
@@ -3737,7 +4003,7 @@
       </w:r>
       <w:r>
         <w:rPr>
-          <w:rFonts w:eastAsia="Arial" w:cs="Arial"/>
+          <w:rFonts w:eastAsia="Palatino" w:cs="Palatino" w:ascii="Palatino" w:hAnsi="Palatino"/>
           <w:bCs/>
           <w:sz w:val="20"/>
           <w:szCs w:val="20"/>
@@ -3747,7 +4013,7 @@
       </w:r>
       <w:r>
         <w:rPr>
-          <w:rFonts w:eastAsia="Arial" w:cs="Arial"/>
+          <w:rFonts w:eastAsia="Palatino" w:cs="Palatino" w:ascii="Palatino" w:hAnsi="Palatino"/>
           <w:sz w:val="20"/>
           <w:szCs w:val="20"/>
           <w:color w:val="292D32"/>
@@ -3756,7 +4022,7 @@
       </w:r>
       <w:r>
         <w:rPr>
-          <w:rFonts w:eastAsia="Arial" w:cs="Arial"/>
+          <w:rFonts w:eastAsia="Palatino" w:cs="Palatino" w:ascii="Palatino" w:hAnsi="Palatino"/>
           <w:bCs/>
           <w:sz w:val="20"/>
           <w:szCs w:val="20"/>
@@ -3766,7 +4032,7 @@
       </w:r>
       <w:r>
         <w:rPr>
-          <w:rFonts w:eastAsia="Arial" w:cs="Arial"/>
+          <w:rFonts w:eastAsia="Palatino" w:cs="Palatino" w:ascii="Palatino" w:hAnsi="Palatino"/>
           <w:bCs/>
           <w:sz w:val="20"/>
           <w:szCs w:val="20"/>
@@ -3776,7 +4042,7 @@
       </w:r>
       <w:r>
         <w:rPr>
-          <w:rFonts w:eastAsia="Arial" w:cs="Arial"/>
+          <w:rFonts w:eastAsia="Palatino" w:cs="Palatino" w:ascii="Palatino" w:hAnsi="Palatino"/>
           <w:bCs/>
           <w:sz w:val="20"/>
           <w:szCs w:val="20"/>
@@ -3803,7 +4069,7 @@
       </w:pPr>
       <w:r>
         <w:rPr>
-          <w:rFonts w:eastAsia="Arial" w:cs="Arial"/>
+          <w:rFonts w:eastAsia="Palatino" w:cs="Palatino" w:ascii="Palatino" w:hAnsi="Palatino"/>
           <w:bCs/>
           <w:sz w:val="20"/>
           <w:szCs w:val="20"/>
@@ -3813,7 +4079,7 @@
       </w:r>
       <w:r>
         <w:rPr>
-          <w:rFonts w:eastAsia="Arial" w:cs="Arial"/>
+          <w:rFonts w:eastAsia="Palatino" w:cs="Palatino" w:ascii="Palatino" w:hAnsi="Palatino"/>
           <w:bCs/>
           <w:sz w:val="20"/>
           <w:szCs w:val="20"/>
@@ -3823,7 +4089,7 @@
       </w:r>
       <w:r>
         <w:rPr>
-          <w:rFonts w:eastAsia="Arial" w:cs="Arial"/>
+          <w:rFonts w:eastAsia="Palatino" w:cs="Palatino" w:ascii="Palatino" w:hAnsi="Palatino"/>
           <w:bCs/>
           <w:sz w:val="20"/>
           <w:szCs w:val="20"/>
@@ -3833,7 +4099,7 @@
       </w:r>
       <w:r>
         <w:rPr>
-          <w:rFonts w:eastAsia="Arial" w:cs="Arial"/>
+          <w:rFonts w:eastAsia="Palatino" w:cs="Palatino" w:ascii="Palatino" w:hAnsi="Palatino"/>
           <w:bCs/>
           <w:sz w:val="20"/>
           <w:szCs w:val="20"/>
@@ -3860,7 +4126,7 @@
       </w:pPr>
       <w:r>
         <w:rPr>
-          <w:rFonts w:eastAsia="Arial" w:cs="Arial"/>
+          <w:rFonts w:eastAsia="Palatino" w:cs="Palatino" w:ascii="Palatino" w:hAnsi="Palatino"/>
           <w:bCs/>
           <w:sz w:val="20"/>
           <w:szCs w:val="20"/>
@@ -3870,7 +4136,7 @@
       </w:r>
       <w:r>
         <w:rPr>
-          <w:rFonts w:eastAsia="Arial" w:cs="Arial"/>
+          <w:rFonts w:eastAsia="Palatino" w:cs="Palatino" w:ascii="Palatino" w:hAnsi="Palatino"/>
           <w:bCs/>
           <w:sz w:val="20"/>
           <w:szCs w:val="20"/>
@@ -3880,7 +4146,7 @@
       </w:r>
       <w:r>
         <w:rPr>
-          <w:rFonts w:eastAsia="Arial" w:cs="Arial"/>
+          <w:rFonts w:eastAsia="Palatino" w:cs="Palatino" w:ascii="Palatino" w:hAnsi="Palatino"/>
           <w:bCs/>
           <w:sz w:val="20"/>
           <w:szCs w:val="20"/>
@@ -3890,7 +4156,7 @@
       </w:r>
       <w:r>
         <w:rPr>
-          <w:rFonts w:eastAsia="Arial" w:cs="Arial"/>
+          <w:rFonts w:eastAsia="Palatino" w:cs="Palatino" w:ascii="Palatino" w:hAnsi="Palatino"/>
           <w:bCs/>
           <w:sz w:val="20"/>
           <w:szCs w:val="20"/>
@@ -3917,7 +4183,7 @@
       </w:pPr>
       <w:r>
         <w:rPr>
-          <w:rFonts w:eastAsia="Arial" w:cs="Arial"/>
+          <w:rFonts w:eastAsia="Palatino" w:cs="Palatino" w:ascii="Palatino" w:hAnsi="Palatino"/>
           <w:bCs/>
           <w:sz w:val="20"/>
           <w:szCs w:val="20"/>
@@ -3927,7 +4193,7 @@
       </w:r>
       <w:r>
         <w:rPr>
-          <w:rFonts w:eastAsia="Arial" w:cs="Arial"/>
+          <w:rFonts w:eastAsia="Palatino" w:cs="Palatino" w:ascii="Palatino" w:hAnsi="Palatino"/>
           <w:bCs/>
           <w:sz w:val="20"/>
           <w:szCs w:val="20"/>
@@ -3937,7 +4203,7 @@
       </w:r>
       <w:r>
         <w:rPr>
-          <w:rFonts w:eastAsia="Arial" w:cs="Arial"/>
+          <w:rFonts w:eastAsia="Palatino" w:cs="Palatino" w:ascii="Palatino" w:hAnsi="Palatino"/>
           <w:bCs/>
           <w:sz w:val="20"/>
           <w:szCs w:val="20"/>
@@ -3947,7 +4213,7 @@
       </w:r>
       <w:r>
         <w:rPr>
-          <w:rFonts w:eastAsia="Arial" w:cs="Arial"/>
+          <w:rFonts w:eastAsia="Palatino" w:cs="Palatino" w:ascii="Palatino" w:hAnsi="Palatino"/>
           <w:bCs/>
           <w:sz w:val="20"/>
           <w:szCs w:val="20"/>
@@ -3974,7 +4240,7 @@
       </w:pPr>
       <w:r>
         <w:rPr>
-          <w:rFonts w:eastAsia="Arial" w:cs="Arial"/>
+          <w:rFonts w:eastAsia="Palatino" w:cs="Palatino" w:ascii="Palatino" w:hAnsi="Palatino"/>
           <w:bCs/>
           <w:sz w:val="20"/>
           <w:szCs w:val="20"/>
@@ -3984,7 +4250,7 @@
       </w:r>
       <w:r>
         <w:rPr>
-          <w:rFonts w:eastAsia="Arial" w:cs="Arial"/>
+          <w:rFonts w:eastAsia="Palatino" w:cs="Palatino" w:ascii="Palatino" w:hAnsi="Palatino"/>
           <w:sz w:val="20"/>
           <w:szCs w:val="20"/>
           <w:color w:val="292D32"/>
@@ -3993,7 +4259,7 @@
       </w:r>
       <w:r>
         <w:rPr>
-          <w:rFonts w:eastAsia="Arial" w:cs="Arial"/>
+          <w:rFonts w:eastAsia="Palatino" w:cs="Palatino" w:ascii="Palatino" w:hAnsi="Palatino"/>
           <w:bCs/>
           <w:sz w:val="20"/>
           <w:szCs w:val="20"/>
@@ -4020,7 +4286,7 @@
       </w:pPr>
       <w:r>
         <w:rPr>
-          <w:rFonts w:eastAsia="Arial" w:cs="Arial"/>
+          <w:rFonts w:eastAsia="Palatino" w:cs="Palatino" w:ascii="Palatino" w:hAnsi="Palatino"/>
           <w:bCs/>
           <w:sz w:val="20"/>
           <w:szCs w:val="20"/>
@@ -4030,7 +4296,7 @@
       </w:r>
       <w:r>
         <w:rPr>
-          <w:rFonts w:eastAsia="Arial" w:cs="Arial"/>
+          <w:rFonts w:eastAsia="Palatino" w:cs="Palatino" w:ascii="Palatino" w:hAnsi="Palatino"/>
           <w:bCs/>
           <w:sz w:val="20"/>
           <w:szCs w:val="20"/>
@@ -4041,7 +4307,7 @@
       </w:r>
       <w:r>
         <w:rPr>
-          <w:rFonts w:eastAsia="Arial" w:cs="Arial"/>
+          <w:rFonts w:eastAsia="Palatino" w:cs="Palatino" w:ascii="Palatino" w:hAnsi="Palatino"/>
           <w:bCs/>
           <w:sz w:val="20"/>
           <w:szCs w:val="20"/>
@@ -4051,7 +4317,7 @@
       </w:r>
       <w:r>
         <w:rPr>
-          <w:rFonts w:eastAsia="Arial" w:cs="Arial"/>
+          <w:rFonts w:eastAsia="Palatino" w:cs="Palatino" w:ascii="Palatino" w:hAnsi="Palatino"/>
           <w:sz w:val="20"/>
           <w:szCs w:val="20"/>
           <w:color w:val="292D32"/>
@@ -4060,7 +4326,7 @@
       </w:r>
       <w:r>
         <w:rPr>
-          <w:rFonts w:eastAsia="Arial" w:cs="Arial"/>
+          <w:rFonts w:eastAsia="Palatino" w:cs="Palatino" w:ascii="Palatino" w:hAnsi="Palatino"/>
           <w:sz w:val="20"/>
           <w:szCs w:val="20"/>
           <w:color w:val="292D32"/>
@@ -4069,7 +4335,7 @@
       </w:r>
       <w:r>
         <w:rPr>
-          <w:rFonts w:eastAsia="Arial" w:cs="Arial"/>
+          <w:rFonts w:eastAsia="Palatino" w:cs="Palatino" w:ascii="Palatino" w:hAnsi="Palatino"/>
           <w:bCs/>
           <w:sz w:val="20"/>
           <w:szCs w:val="20"/>
@@ -4079,7 +4345,7 @@
       </w:r>
       <w:r>
         <w:rPr>
-          <w:rFonts w:eastAsia="Arial" w:cs="Arial"/>
+          <w:rFonts w:eastAsia="Palatino" w:cs="Palatino" w:ascii="Palatino" w:hAnsi="Palatino"/>
           <w:bCs/>
           <w:sz w:val="20"/>
           <w:szCs w:val="20"/>
@@ -4089,7 +4355,7 @@
       </w:r>
       <w:r>
         <w:rPr>
-          <w:rFonts w:eastAsia="Arial" w:cs="Arial"/>
+          <w:rFonts w:eastAsia="Palatino" w:cs="Palatino" w:ascii="Palatino" w:hAnsi="Palatino"/>
           <w:bCs/>
           <w:sz w:val="20"/>
           <w:szCs w:val="20"/>
@@ -4099,7 +4365,7 @@
       </w:r>
       <w:r>
         <w:rPr>
-          <w:rFonts w:eastAsia="Arial" w:cs="Arial"/>
+          <w:rFonts w:eastAsia="Palatino" w:cs="Palatino" w:ascii="Palatino" w:hAnsi="Palatino"/>
           <w:bCs/>
           <w:sz w:val="20"/>
           <w:szCs w:val="20"/>
@@ -4126,7 +4392,7 @@
       </w:pPr>
       <w:r>
         <w:rPr>
-          <w:rFonts w:eastAsia="Arial" w:cs="Arial"/>
+          <w:rFonts w:eastAsia="Palatino" w:cs="Palatino" w:ascii="Palatino" w:hAnsi="Palatino"/>
           <w:bCs/>
           <w:sz w:val="20"/>
           <w:szCs w:val="20"/>
@@ -4136,7 +4402,7 @@
       </w:r>
       <w:r>
         <w:rPr>
-          <w:rFonts w:eastAsia="Arial" w:cs="Arial"/>
+          <w:rFonts w:eastAsia="Palatino" w:cs="Palatino" w:ascii="Palatino" w:hAnsi="Palatino"/>
           <w:sz w:val="20"/>
           <w:szCs w:val="20"/>
           <w:color w:val="292D32"/>
@@ -4145,7 +4411,7 @@
       </w:r>
       <w:r>
         <w:rPr>
-          <w:rFonts w:eastAsia="Arial" w:cs="Arial"/>
+          <w:rFonts w:eastAsia="Palatino" w:cs="Palatino" w:ascii="Palatino" w:hAnsi="Palatino"/>
           <w:bCs/>
           <w:sz w:val="20"/>
           <w:szCs w:val="20"/>
@@ -4155,7 +4421,7 @@
       </w:r>
       <w:r>
         <w:rPr>
-          <w:rFonts w:eastAsia="Arial" w:cs="Arial"/>
+          <w:rFonts w:eastAsia="Palatino" w:cs="Palatino" w:ascii="Palatino" w:hAnsi="Palatino"/>
           <w:bCs/>
           <w:sz w:val="20"/>
           <w:szCs w:val="20"/>
@@ -4165,7 +4431,7 @@
       </w:r>
       <w:r>
         <w:rPr>
-          <w:rFonts w:eastAsia="Arial" w:cs="Arial"/>
+          <w:rFonts w:eastAsia="Palatino" w:cs="Palatino" w:ascii="Palatino" w:hAnsi="Palatino"/>
           <w:bCs/>
           <w:sz w:val="20"/>
           <w:szCs w:val="20"/>
@@ -4175,7 +4441,7 @@
       </w:r>
       <w:r>
         <w:rPr>
-          <w:rFonts w:eastAsia="Arial" w:cs="Arial"/>
+          <w:rFonts w:eastAsia="Palatino" w:cs="Palatino" w:ascii="Palatino" w:hAnsi="Palatino"/>
           <w:bCs/>
           <w:sz w:val="20"/>
           <w:szCs w:val="20"/>
@@ -4185,7 +4451,7 @@
       </w:r>
       <w:r>
         <w:rPr>
-          <w:rFonts w:eastAsia="Arial" w:cs="Arial"/>
+          <w:rFonts w:eastAsia="Palatino" w:cs="Palatino" w:ascii="Palatino" w:hAnsi="Palatino"/>
           <w:bCs/>
           <w:sz w:val="20"/>
           <w:szCs w:val="20"/>
@@ -4195,7 +4461,7 @@
       </w:r>
       <w:r>
         <w:rPr>
-          <w:rFonts w:eastAsia="Arial" w:cs="Arial"/>
+          <w:rFonts w:eastAsia="Palatino" w:cs="Palatino" w:ascii="Palatino" w:hAnsi="Palatino"/>
           <w:sz w:val="20"/>
           <w:szCs w:val="20"/>
           <w:color w:val="292D32"/>
@@ -4221,7 +4487,7 @@
       </w:pPr>
       <w:r>
         <w:rPr>
-          <w:rFonts w:eastAsia="Arial" w:cs="Arial"/>
+          <w:rFonts w:eastAsia="Palatino" w:cs="Palatino" w:ascii="Palatino" w:hAnsi="Palatino"/>
           <w:bCs/>
           <w:sz w:val="20"/>
           <w:szCs w:val="20"/>
@@ -4231,7 +4497,7 @@
       </w:r>
       <w:r>
         <w:rPr>
-          <w:rFonts w:eastAsia="Arial" w:cs="Arial"/>
+          <w:rFonts w:eastAsia="Palatino" w:cs="Palatino" w:ascii="Palatino" w:hAnsi="Palatino"/>
           <w:bCs/>
           <w:sz w:val="20"/>
           <w:szCs w:val="20"/>
@@ -4257,7 +4523,7 @@
       </w:pPr>
       <w:r>
         <w:rPr>
-          <w:rFonts w:eastAsia="Arial" w:cs="Arial"/>
+          <w:rFonts w:eastAsia="Arial" w:cs="Arial" w:ascii="Arial" w:hAnsi="Arial"/>
           <w:color w:val="253D50"/>
           <w:sz w:val="21"/>
           <w:b/>
@@ -4280,7 +4546,7 @@
       </w:pPr>
       <w:r>
         <w:rPr>
-          <w:rFonts w:eastAsia="Arial" w:cs="Arial"/>
+          <w:rFonts w:eastAsia="Palatino" w:cs="Palatino" w:ascii="Palatino" w:hAnsi="Palatino"/>
           <w:sz w:val="20"/>
           <w:szCs w:val="20"/>
           <w:b/>
@@ -4290,7 +4556,7 @@
       </w:r>
       <w:r>
         <w:rPr>
-          <w:rFonts w:eastAsia="Arial" w:cs="Arial"/>
+          <w:rFonts w:eastAsia="Palatino" w:cs="Palatino" w:ascii="Palatino" w:hAnsi="Palatino"/>
           <w:b w:val="0"/>
           <w:bCs/>
           <w:i/>
@@ -4303,7 +4569,7 @@
       </w:r>
       <w:r>
         <w:rPr>
-          <w:rFonts w:eastAsia="Arial" w:cs="Arial"/>
+          <w:rFonts w:eastAsia="Palatino" w:cs="Palatino" w:ascii="Palatino" w:hAnsi="Palatino"/>
           <w:b w:val="0"/>
           <w:bCs/>
           <w:i w:val="0"/>
@@ -4316,7 +4582,7 @@
       </w:r>
       <w:r>
         <w:rPr>
-          <w:rFonts w:eastAsia="Arial" w:cs="Arial"/>
+          <w:rFonts w:eastAsia="Palatino" w:cs="Palatino" w:ascii="Palatino" w:hAnsi="Palatino"/>
           <w:b w:val="0"/>
           <w:i w:val="0"/>
           <w:iCs/>
@@ -4345,7 +4611,7 @@
       </w:pPr>
       <w:r>
         <w:rPr>
-          <w:rFonts w:eastAsia="Arial" w:cs="Arial"/>
+          <w:rFonts w:eastAsia="Palatino" w:cs="Palatino" w:ascii="Palatino" w:hAnsi="Palatino"/>
           <w:bCs/>
           <w:sz w:val="20"/>
           <w:szCs w:val="20"/>
@@ -4372,7 +4638,7 @@
       </w:pPr>
       <w:r>
         <w:rPr>
-          <w:rFonts w:eastAsia="Arial" w:cs="Arial"/>
+          <w:rFonts w:eastAsia="Palatino" w:cs="Palatino" w:ascii="Palatino" w:hAnsi="Palatino"/>
           <w:bCs/>
           <w:sz w:val="20"/>
           <w:szCs w:val="20"/>
@@ -4395,7 +4661,7 @@
       </w:pPr>
       <w:r>
         <w:rPr>
-          <w:rFonts w:eastAsia="Arial" w:cs="Arial"/>
+          <w:rFonts w:eastAsia="Palatino" w:cs="Palatino" w:ascii="Palatino" w:hAnsi="Palatino"/>
           <w:b/>
           <w:bCs/>
           <w:sz w:val="20"/>
@@ -4406,7 +4672,7 @@
       </w:r>
       <w:r>
         <w:rPr>
-          <w:rFonts w:eastAsia="Arial" w:cs="Arial"/>
+          <w:rFonts w:eastAsia="Palatino" w:cs="Palatino" w:ascii="Palatino" w:hAnsi="Palatino"/>
           <w:b/>
           <w:bCs/>
           <w:i/>
@@ -4419,7 +4685,7 @@
       </w:r>
       <w:r>
         <w:rPr>
-          <w:rFonts w:eastAsia="Arial" w:cs="Arial"/>
+          <w:rFonts w:eastAsia="Palatino" w:cs="Palatino" w:ascii="Palatino" w:hAnsi="Palatino"/>
           <w:b w:val="0"/>
           <w:i/>
           <w:iCs/>
@@ -4431,7 +4697,7 @@
       </w:r>
       <w:r>
         <w:rPr>
-          <w:rFonts w:eastAsia="Arial" w:cs="Arial"/>
+          <w:rFonts w:eastAsia="Palatino" w:cs="Palatino" w:ascii="Palatino" w:hAnsi="Palatino"/>
           <w:b w:val="0"/>
           <w:i w:val="0"/>
           <w:iCs/>
@@ -4443,7 +4709,7 @@
       </w:r>
       <w:r>
         <w:rPr>
-          <w:rFonts w:eastAsia="Arial" w:cs="Arial"/>
+          <w:rFonts w:eastAsia="Palatino" w:cs="Palatino" w:ascii="Palatino" w:hAnsi="Palatino"/>
           <w:b w:val="0"/>
           <w:bCs/>
           <w:i w:val="0"/>
@@ -4473,7 +4739,7 @@
       </w:pPr>
       <w:r>
         <w:rPr>
-          <w:rFonts w:eastAsia="Arial" w:cs="Arial"/>
+          <w:rFonts w:eastAsia="Palatino" w:cs="Palatino" w:ascii="Palatino" w:hAnsi="Palatino"/>
           <w:bCs/>
           <w:sz w:val="20"/>
           <w:szCs w:val="20"/>
@@ -4496,7 +4762,7 @@
       </w:pPr>
       <w:r>
         <w:rPr>
-          <w:rFonts w:eastAsia="Arial" w:cs="Arial"/>
+          <w:rFonts w:eastAsia="Palatino" w:cs="Palatino" w:ascii="Palatino" w:hAnsi="Palatino"/>
           <w:b/>
           <w:bCs/>
           <w:sz w:val="20"/>
@@ -4507,7 +4773,7 @@
       </w:r>
       <w:r>
         <w:rPr>
-          <w:rFonts w:eastAsia="Arial" w:cs="Arial"/>
+          <w:rFonts w:eastAsia="Palatino" w:cs="Palatino" w:ascii="Palatino" w:hAnsi="Palatino"/>
           <w:b/>
           <w:bCs/>
           <w:i/>
@@ -4520,7 +4786,7 @@
       </w:r>
       <w:r>
         <w:rPr>
-          <w:rFonts w:eastAsia="Arial" w:cs="Arial"/>
+          <w:rFonts w:eastAsia="Palatino" w:cs="Palatino" w:ascii="Palatino" w:hAnsi="Palatino"/>
           <w:b w:val="0"/>
           <w:bCs/>
           <w:i/>
@@ -4533,7 +4799,7 @@
       </w:r>
       <w:r>
         <w:rPr>
-          <w:rFonts w:eastAsia="Arial" w:cs="Arial"/>
+          <w:rFonts w:eastAsia="Palatino" w:cs="Palatino" w:ascii="Palatino" w:hAnsi="Palatino"/>
           <w:b w:val="0"/>
           <w:bCs/>
           <w:i/>
@@ -4546,7 +4812,7 @@
       </w:r>
       <w:r>
         <w:rPr>
-          <w:rFonts w:eastAsia="Arial" w:cs="Arial"/>
+          <w:rFonts w:eastAsia="Palatino" w:cs="Palatino" w:ascii="Palatino" w:hAnsi="Palatino"/>
           <w:b w:val="0"/>
           <w:bCs/>
           <w:i/>
@@ -4559,7 +4825,7 @@
       </w:r>
       <w:r>
         <w:rPr>
-          <w:rFonts w:eastAsia="Arial" w:cs="Arial"/>
+          <w:rFonts w:eastAsia="Palatino" w:cs="Palatino" w:ascii="Palatino" w:hAnsi="Palatino"/>
           <w:b w:val="0"/>
           <w:bCs/>
           <w:i/>
@@ -4572,7 +4838,7 @@
       </w:r>
       <w:r>
         <w:rPr>
-          <w:rFonts w:eastAsia="Arial" w:cs="Arial"/>
+          <w:rFonts w:eastAsia="Palatino" w:cs="Palatino" w:ascii="Palatino" w:hAnsi="Palatino"/>
           <w:b w:val="0"/>
           <w:bCs/>
           <w:i w:val="0"/>
@@ -4585,7 +4851,7 @@
       </w:r>
       <w:r>
         <w:rPr>
-          <w:rFonts w:eastAsia="Arial" w:cs="Arial"/>
+          <w:rFonts w:eastAsia="Palatino" w:cs="Palatino" w:ascii="Palatino" w:hAnsi="Palatino"/>
           <w:b w:val="0"/>
           <w:bCs/>
           <w:i w:val="0"/>
@@ -4615,7 +4881,7 @@
       </w:pPr>
       <w:r>
         <w:rPr>
-          <w:rFonts w:eastAsia="Arial" w:cs="Arial"/>
+          <w:rFonts w:eastAsia="Palatino" w:cs="Palatino" w:ascii="Palatino" w:hAnsi="Palatino"/>
           <w:bCs/>
           <w:sz w:val="20"/>
           <w:szCs w:val="20"/>
@@ -4625,7 +4891,7 @@
       </w:r>
       <w:r>
         <w:rPr>
-          <w:rFonts w:eastAsia="Arial" w:cs="Arial"/>
+          <w:rFonts w:eastAsia="Palatino" w:cs="Palatino" w:ascii="Palatino" w:hAnsi="Palatino"/>
           <w:bCs/>
           <w:sz w:val="20"/>
           <w:szCs w:val="20"/>
@@ -4635,7 +4901,7 @@
       </w:r>
       <w:r>
         <w:rPr>
-          <w:rFonts w:eastAsia="Arial" w:cs="Arial"/>
+          <w:rFonts w:eastAsia="Palatino" w:cs="Palatino" w:ascii="Palatino" w:hAnsi="Palatino"/>
           <w:bCs/>
           <w:sz w:val="20"/>
           <w:szCs w:val="20"/>
@@ -4662,7 +4928,7 @@
       </w:pPr>
       <w:r>
         <w:rPr>
-          <w:rFonts w:eastAsia="Arial" w:cs="Arial"/>
+          <w:rFonts w:eastAsia="Palatino" w:cs="Palatino" w:ascii="Palatino" w:hAnsi="Palatino"/>
           <w:bCs/>
           <w:sz w:val="20"/>
           <w:szCs w:val="20"/>
@@ -4672,7 +4938,7 @@
       </w:r>
       <w:r>
         <w:rPr>
-          <w:rFonts w:eastAsia="Arial" w:cs="Arial"/>
+          <w:rFonts w:eastAsia="Palatino" w:cs="Palatino" w:ascii="Palatino" w:hAnsi="Palatino"/>
           <w:bCs/>
           <w:sz w:val="20"/>
           <w:szCs w:val="20"/>
@@ -4682,7 +4948,7 @@
       </w:r>
       <w:r>
         <w:rPr>
-          <w:rFonts w:eastAsia="Arial" w:cs="Arial"/>
+          <w:rFonts w:eastAsia="Palatino" w:cs="Palatino" w:ascii="Palatino" w:hAnsi="Palatino"/>
           <w:bCs/>
           <w:sz w:val="20"/>
           <w:szCs w:val="20"/>
@@ -4705,7 +4971,7 @@
       </w:pPr>
       <w:r>
         <w:rPr>
-          <w:rFonts w:eastAsia="Arial" w:cs="Arial"/>
+          <w:rFonts w:eastAsia="Palatino" w:cs="Palatino" w:ascii="Palatino" w:hAnsi="Palatino"/>
           <w:b/>
           <w:bCs/>
           <w:sz w:val="20"/>
@@ -4716,7 +4982,7 @@
       </w:r>
       <w:r>
         <w:rPr>
-          <w:rFonts w:eastAsia="Arial" w:cs="Arial"/>
+          <w:rFonts w:eastAsia="Palatino" w:cs="Palatino" w:ascii="Palatino" w:hAnsi="Palatino"/>
           <w:b w:val="0"/>
           <w:i/>
           <w:iCs/>
@@ -4728,7 +4994,7 @@
       </w:r>
       <w:r>
         <w:rPr>
-          <w:rFonts w:eastAsia="Arial" w:cs="Arial"/>
+          <w:rFonts w:eastAsia="Palatino" w:cs="Palatino" w:ascii="Palatino" w:hAnsi="Palatino"/>
           <w:b w:val="0"/>
           <w:i w:val="0"/>
           <w:iCs/>
@@ -4740,7 +5006,7 @@
       </w:r>
       <w:r>
         <w:rPr>
-          <w:rFonts w:eastAsia="Arial" w:cs="Arial"/>
+          <w:rFonts w:eastAsia="Palatino" w:cs="Palatino" w:ascii="Palatino" w:hAnsi="Palatino"/>
           <w:b w:val="0"/>
           <w:bCs/>
           <w:i w:val="0"/>
@@ -4770,7 +5036,7 @@
       </w:pPr>
       <w:r>
         <w:rPr>
-          <w:rFonts w:eastAsia="Arial" w:cs="Arial"/>
+          <w:rFonts w:eastAsia="Palatino" w:cs="Palatino" w:ascii="Palatino" w:hAnsi="Palatino"/>
           <w:sz w:val="20"/>
           <w:szCs w:val="20"/>
           <w:color w:val="292D32"/>
@@ -4781,6 +5047,8 @@
     <w:sectPr>
       <w:headerReference w:type="default" r:id="rId15"/>
       <w:footerReference w:type="default" r:id="rId16"/>
+      <w:headerReference w:type="first" r:id="rId19"/>
+      <w:headerReference w:type="even" r:id="rId20"/>
       <w:pgSz w:w="12240" w:h="15840"/>
       <w:pgMar w:top="547" w:right="691" w:bottom="547" w:left="691" w:header="230" w:footer="230" w:gutter="0"/>
       <w:cols w:space="720"/>
@@ -4854,12 +5122,11 @@
 <w:hdr xmlns:wpc="http://schemas.microsoft.com/office/word/2010/wordprocessingCanvas" xmlns:cx="http://schemas.microsoft.com/office/drawing/2014/chartex" xmlns:cx1="http://schemas.microsoft.com/office/drawing/2015/9/8/chartex" xmlns:cx2="http://schemas.microsoft.com/office/drawing/2015/10/21/chartex" xmlns:cx3="http://schemas.microsoft.com/office/drawing/2016/5/9/chartex" xmlns:cx4="http://schemas.microsoft.com/office/drawing/2016/5/10/chartex" xmlns:cx5="http://schemas.microsoft.com/office/drawing/2016/5/11/chartex" xmlns:cx6="http://schemas.microsoft.com/office/drawing/2016/5/12/chartex" xmlns:cx7="http://schemas.microsoft.com/office/drawing/2016/5/13/chartex" xmlns:cx8="http://schemas.microsoft.com/office/drawing/2016/5/14/chartex" xmlns:mc="http://schemas.openxmlformats.org/markup-compatibility/2006" xmlns:aink="http://schemas.microsoft.com/office/drawing/2016/ink" xmlns:am3d="http://schemas.microsoft.com/office/drawing/2017/model3d" xmlns:o="urn:schemas-microsoft-com:office:office" xmlns:oel="http://schemas.microsoft.com/office/2019/extlst" xmlns:r="http://schemas.openxmlformats.org/officeDocument/2006/relationships" xmlns:m="http://schemas.openxmlformats.org/officeDocument/2006/math" xmlns:v="urn:schemas-microsoft-com:vml" xmlns:wp14="http://schemas.microsoft.com/office/word/2010/wordprocessingDrawing" xmlns:wp="http://schemas.openxmlformats.org/drawingml/2006/wordprocessingDrawing" xmlns:w10="urn:schemas-microsoft-com:office:word" xmlns:w="http://schemas.openxmlformats.org/wordprocessingml/2006/main" xmlns:w14="http://schemas.microsoft.com/office/word/2010/wordml" xmlns:w15="http://schemas.microsoft.com/office/word/2012/wordml" xmlns:w16cex="http://schemas.microsoft.com/office/word/2018/wordml/cex" xmlns:w16cid="http://schemas.microsoft.com/office/word/2016/wordml/cid" xmlns:w16="http://schemas.microsoft.com/office/word/2018/wordml" xmlns:w16du="http://schemas.microsoft.com/office/word/2023/wordml/word16du" xmlns:w16sdtdh="http://schemas.microsoft.com/office/word/2020/wordml/sdtdatahash" xmlns:w16sdtfl="http://schemas.microsoft.com/office/word/2024/wordml/sdtformatlock" xmlns:w16se="http://schemas.microsoft.com/office/word/2015/wordml/symex" xmlns:wpg="http://schemas.microsoft.com/office/word/2010/wordprocessingGroup" xmlns:wpi="http://schemas.microsoft.com/office/word/2010/wordprocessingInk" xmlns:wne="http://schemas.microsoft.com/office/word/2006/wordml" xmlns:wps="http://schemas.microsoft.com/office/word/2010/wordprocessingShape" mc:Ignorable="w14 w15 w16se w16cid w16 w16cex w16sdtdh w16sdtfl w16du wp14">
   <w:p>
     <w:pPr>
-      <w:pStyle w:val="Header"/>
       <w:tabs>
-        <w:tab w:val="clear" w:pos="9360"/>
-        <w:tab w:val="right" w:pos="7380"/>
+        <w:tab w:pos="10858" w:val="right"/>
       </w:tabs>
-      <w:ind w:right="-3510"/>
+      <w:ind w:right="0" w:left="0" w:firstLine="0"/>
+      <w:jc w:val="left"/>
       <w:rPr>
         <w:rFonts w:ascii="Aptos" w:hAnsi="Aptos"/>
         <w:i/>
@@ -4871,74 +5138,35 @@
     </w:pPr>
     <w:r>
       <w:rPr>
+        <w:rFonts w:ascii="Arial" w:hAnsi="Arial"/>
         <w:i/>
-        <w:iCs/>
-        <w:color w:val="D0CECE" w:themeColor="background2" w:themeShade="E6"/>
+        <w:color w:val="B0B0B0"/>
         <w:sz w:val="14"/>
-        <w:szCs w:val="20"/>
       </w:rPr>
       <w:t>Samya Samanta</w:t>
+      <w:tab/>
+      <w:t>resume</w:t>
     </w:r>
-    <w:r>
-      <w:rPr>
-        <w:i/>
-        <w:iCs/>
-        <w:color w:val="D0CECE" w:themeColor="background2" w:themeShade="E6"/>
-        <w:sz w:val="14"/>
-        <w:szCs w:val="20"/>
-      </w:rPr>
-      <w:tab/>
-    </w:r>
-    <w:r>
-      <w:rPr>
-        <w:i/>
-        <w:iCs/>
-        <w:color w:val="D0CECE" w:themeColor="background2" w:themeShade="E6"/>
-        <w:sz w:val="14"/>
-        <w:szCs w:val="20"/>
-      </w:rPr>
-      <w:tab/>
-    </w:r>
-    <w:r>
-      <w:rPr>
-        <w:i/>
-        <w:iCs/>
-        <w:color w:val="D0CECE" w:themeColor="background2" w:themeShade="E6"/>
-        <w:sz w:val="14"/>
-        <w:szCs w:val="20"/>
-      </w:rPr>
-      <w:tab/>
-    </w:r>
-    <w:r>
-      <w:rPr>
-        <w:i/>
-        <w:iCs/>
-        <w:color w:val="D0CECE" w:themeColor="background2" w:themeShade="E6"/>
-        <w:sz w:val="14"/>
-        <w:szCs w:val="20"/>
-      </w:rPr>
-      <w:tab/>
-    </w:r>
-    <w:r>
-      <w:rPr>
-        <w:i/>
-        <w:iCs/>
-        <w:color w:val="D0CECE" w:themeColor="background2" w:themeShade="E6"/>
-        <w:sz w:val="14"/>
-        <w:szCs w:val="20"/>
-      </w:rPr>
-      <w:tab/>
-    </w:r>
-    <w:r>
-      <w:rPr>
-        <w:i/>
-        <w:iCs/>
-        <w:color w:val="D0CECE" w:themeColor="background2" w:themeShade="E6"/>
-        <w:sz w:val="14"/>
-        <w:szCs w:val="20"/>
-      </w:rPr>
-      <w:t xml:space="preserve">            resume</w:t>
-    </w:r>
+  </w:p>
+</w:hdr>
+</file>
+
+<file path=word/header2.xml><?xml version="1.0" encoding="utf-8"?>
+<w:hdr xmlns:m="http://schemas.openxmlformats.org/officeDocument/2006/math" xmlns:mc="http://schemas.openxmlformats.org/markup-compatibility/2006" xmlns:mo="http://schemas.microsoft.com/office/mac/office/2008/main" xmlns:mv="urn:schemas-microsoft-com:mac:vml" xmlns:o="urn:schemas-microsoft-com:office:office" xmlns:r="http://schemas.openxmlformats.org/officeDocument/2006/relationships" xmlns:v="urn:schemas-microsoft-com:vml" xmlns:w10="urn:schemas-microsoft-com:office:word" xmlns:w14="http://schemas.microsoft.com/office/word/2010/wordml" xmlns:w="http://schemas.openxmlformats.org/wordprocessingml/2006/main" xmlns:wne="http://schemas.microsoft.com/office/word/2006/wordml" xmlns:wp14="http://schemas.microsoft.com/office/word/2010/wordprocessingDrawing" xmlns:wp="http://schemas.openxmlformats.org/drawingml/2006/wordprocessingDrawing" xmlns:wpc="http://schemas.microsoft.com/office/word/2010/wordprocessingCanvas" xmlns:wpg="http://schemas.microsoft.com/office/word/2010/wordprocessingGroup" xmlns:wpi="http://schemas.microsoft.com/office/word/2010/wordprocessingInk" xmlns:wps="http://schemas.microsoft.com/office/word/2010/wordprocessingShape" mc:Ignorable="w14 wp14">
+  <w:p>
+    <w:pPr>
+      <w:pStyle w:val="Header"/>
+    </w:pPr>
+  </w:p>
+</w:hdr>
+</file>
+
+<file path=word/header3.xml><?xml version="1.0" encoding="utf-8"?>
+<w:hdr xmlns:m="http://schemas.openxmlformats.org/officeDocument/2006/math" xmlns:mc="http://schemas.openxmlformats.org/markup-compatibility/2006" xmlns:mo="http://schemas.microsoft.com/office/mac/office/2008/main" xmlns:mv="urn:schemas-microsoft-com:mac:vml" xmlns:o="urn:schemas-microsoft-com:office:office" xmlns:r="http://schemas.openxmlformats.org/officeDocument/2006/relationships" xmlns:v="urn:schemas-microsoft-com:vml" xmlns:w10="urn:schemas-microsoft-com:office:word" xmlns:w14="http://schemas.microsoft.com/office/word/2010/wordml" xmlns:w="http://schemas.openxmlformats.org/wordprocessingml/2006/main" xmlns:wne="http://schemas.microsoft.com/office/word/2006/wordml" xmlns:wp14="http://schemas.microsoft.com/office/word/2010/wordprocessingDrawing" xmlns:wp="http://schemas.openxmlformats.org/drawingml/2006/wordprocessingDrawing" xmlns:wpc="http://schemas.microsoft.com/office/word/2010/wordprocessingCanvas" xmlns:wpg="http://schemas.microsoft.com/office/word/2010/wordprocessingGroup" xmlns:wpi="http://schemas.microsoft.com/office/word/2010/wordprocessingInk" xmlns:wps="http://schemas.microsoft.com/office/word/2010/wordprocessingShape" mc:Ignorable="w14 wp14">
+  <w:p>
+    <w:pPr>
+      <w:pStyle w:val="Header"/>
+    </w:pPr>
   </w:p>
 </w:hdr>
 </file>

</xml_diff>